<commit_message>
Started updating Week 1
</commit_message>
<xml_diff>
--- a/syllubus for AI course.docx
+++ b/syllubus for AI course.docx
@@ -1,149 +1,421 @@
 
 <file path=word/document.xml><?xml version="1.0" encoding="utf-8"?>
-<w:document xmlns:wpc="http://schemas.microsoft.com/office/word/2010/wordprocessingCanvas" xmlns:cx="http://schemas.microsoft.com/office/drawing/2014/chartex" xmlns:cx1="http://schemas.microsoft.com/office/drawing/2015/9/8/chartex" xmlns:cx2="http://schemas.microsoft.com/office/drawing/2015/10/21/chartex" xmlns:cx3="http://schemas.microsoft.com/office/drawing/2016/5/9/chartex" xmlns:cx4="http://schemas.microsoft.com/office/drawing/2016/5/10/chartex" xmlns:cx5="http://schemas.microsoft.com/office/drawing/2016/5/11/chartex" xmlns:cx6="http://schemas.microsoft.com/office/drawing/2016/5/12/chartex" xmlns:cx7="http://schemas.microsoft.com/office/drawing/2016/5/13/chartex" xmlns:cx8="http://schemas.microsoft.com/office/drawing/2016/5/14/chartex" xmlns:mc="http://schemas.openxmlformats.org/markup-compatibility/2006" xmlns:aink="http://schemas.microsoft.com/office/drawing/2016/ink" xmlns:am3d="http://schemas.microsoft.com/office/drawing/2017/model3d" xmlns:o="urn:schemas-microsoft-com:office:office" xmlns:oel="http://schemas.microsoft.com/office/2019/extlst" xmlns:r="http://schemas.openxmlformats.org/officeDocument/2006/relationships" xmlns:m="http://schemas.openxmlformats.org/officeDocument/2006/math" xmlns:v="urn:schemas-microsoft-com:vml" xmlns:wp14="http://schemas.microsoft.com/office/word/2010/wordprocessingDrawing" xmlns:wp="http://schemas.openxmlformats.org/drawingml/2006/wordprocessingDrawing" xmlns:w10="urn:schemas-microsoft-com:office:word" xmlns:w="http://schemas.openxmlformats.org/wordprocessingml/2006/main" xmlns:w14="http://schemas.microsoft.com/office/word/2010/wordml" xmlns:w15="http://schemas.microsoft.com/office/word/2012/wordml" xmlns:w16cex="http://schemas.microsoft.com/office/word/2018/wordml/cex" xmlns:w16cid="http://schemas.microsoft.com/office/word/2016/wordml/cid" xmlns:w16="http://schemas.microsoft.com/office/word/2018/wordml" xmlns:w16du="http://schemas.microsoft.com/office/word/2023/wordml/word16du" xmlns:w16sdtdh="http://schemas.microsoft.com/office/word/2020/wordml/sdtdatahash" xmlns:w16sdtfl="http://schemas.microsoft.com/office/word/2024/wordml/sdtformatlock" xmlns:w16se="http://schemas.microsoft.com/office/word/2015/wordml/symex" xmlns:wpg="http://schemas.microsoft.com/office/word/2010/wordprocessingGroup" xmlns:wpi="http://schemas.microsoft.com/office/word/2010/wordprocessingInk" xmlns:wne="http://schemas.microsoft.com/office/word/2006/wordml" xmlns:wps="http://schemas.microsoft.com/office/word/2010/wordprocessingShape" mc:Ignorable="w14 w15 w16se w16cid w16 w16cex w16sdtdh w16sdtfl w16du wp14">
+<w:document xmlns:wpc="http://schemas.microsoft.com/office/word/2010/wordprocessingCanvas" xmlns:cx="http://schemas.microsoft.com/office/drawing/2014/chartex" xmlns:cx1="http://schemas.microsoft.com/office/drawing/2015/9/8/chartex" xmlns:cx2="http://schemas.microsoft.com/office/drawing/2015/10/21/chartex" xmlns:cx3="http://schemas.microsoft.com/office/drawing/2016/5/9/chartex" xmlns:cx4="http://schemas.microsoft.com/office/drawing/2016/5/10/chartex" xmlns:cx5="http://schemas.microsoft.com/office/drawing/2016/5/11/chartex" xmlns:cx6="http://schemas.microsoft.com/office/drawing/2016/5/12/chartex" xmlns:cx7="http://schemas.microsoft.com/office/drawing/2016/5/13/chartex" xmlns:cx8="http://schemas.microsoft.com/office/drawing/2016/5/14/chartex" xmlns:mc="http://schemas.openxmlformats.org/markup-compatibility/2006" xmlns:m="http://schemas.openxmlformats.org/officeDocument/2006/math" xmlns:aink="http://schemas.microsoft.com/office/drawing/2016/ink" xmlns:am3d="http://schemas.microsoft.com/office/drawing/2017/model3d" xmlns:oel="http://schemas.microsoft.com/office/2019/extlst" xmlns:r="http://schemas.openxmlformats.org/officeDocument/2006/relationships" xmlns:wp14="http://schemas.microsoft.com/office/word/2010/wordprocessingDrawing" xmlns:wp="http://schemas.openxmlformats.org/drawingml/2006/wordprocessingDrawing" xmlns:wpg="http://schemas.microsoft.com/office/word/2010/wordprocessingGroup" xmlns:wpi="http://schemas.microsoft.com/office/word/2010/wordprocessingInk" xmlns:wps="http://schemas.microsoft.com/office/word/2010/wordprocessingShape" xmlns:o="urn:schemas-microsoft-com:office:office" xmlns:v="urn:schemas-microsoft-com:vml" xmlns:w10="urn:schemas-microsoft-com:office:word" xmlns:w="http://schemas.openxmlformats.org/wordprocessingml/2006/main" xmlns:w14="http://schemas.microsoft.com/office/word/2010/wordml" xmlns:w15="http://schemas.microsoft.com/office/word/2012/wordml" xmlns:w16cex="http://schemas.microsoft.com/office/word/2018/wordml/cex" xmlns:w16cid="http://schemas.microsoft.com/office/word/2016/wordml/cid" xmlns:w16="http://schemas.microsoft.com/office/word/2018/wordml" xmlns:w16sdtdh="http://schemas.microsoft.com/office/word/2020/wordml/sdtdatahash" xmlns:w16sdtfl="http://schemas.microsoft.com/office/word/2024/wordml/sdtformatlock" xmlns:w16se="http://schemas.microsoft.com/office/word/2015/wordml/symex" xmlns:w16du="http://schemas.microsoft.com/office/word/2023/wordml/word16du" xmlns:wne="http://schemas.microsoft.com/office/word/2006/wordml" mc:Ignorable="w14 w15 w16se w16cid w16 w16cex w16sdtdh w16sdtfl w16du wp14">
   <w:body>
     <w:p>
       <w:pPr>
+        <w:pStyle w:val="Heading2"/>
+      </w:pPr>
+      <w:bookmarkStart w:id="0" w:name="math-6960-phys-6960-me-en-6960"/>
+      <w:bookmarkStart w:id="1" w:name="X38fac15fd08999e775f504954955f52e4a5de78"/>
+      <w:r>
+        <w:t>Special Topics: AI Acceleration for Research, Teaching, and Scientific Communication</w:t>
+      </w:r>
+    </w:p>
+    <w:p>
+      <w:pPr>
+        <w:pStyle w:val="BodyText"/>
+      </w:pPr>
+      <w:bookmarkStart w:id="2" w:name="modality"/>
+      <w:r>
+        <w:rPr>
+          <w:b/>
+          <w:bCs/>
+        </w:rPr>
+        <w:t>Modality</w:t>
+      </w:r>
+      <w:r>
+        <w:t xml:space="preserve">: </w:t>
+      </w:r>
+      <w:r>
+        <w:t>Online Synchronous via Microsoft Teams</w:t>
+      </w:r>
+    </w:p>
+    <w:p>
+      <w:pPr>
+        <w:pStyle w:val="BodyText"/>
+      </w:pPr>
+      <w:bookmarkStart w:id="3" w:name="meeting-time"/>
+      <w:bookmarkEnd w:id="2"/>
+      <w:r>
+        <w:rPr>
+          <w:b/>
+          <w:bCs/>
+        </w:rPr>
+        <w:t>Meeting</w:t>
+      </w:r>
+      <w:r>
+        <w:t xml:space="preserve"> Time</w:t>
+      </w:r>
+      <w:r>
+        <w:t xml:space="preserve">: </w:t>
+      </w:r>
+      <w:r>
+        <w:t>TBD</w:t>
+      </w:r>
+    </w:p>
+    <w:p>
+      <w:pPr>
+        <w:pStyle w:val="BodyText"/>
+      </w:pPr>
+      <w:bookmarkStart w:id="4" w:name="instructor"/>
+      <w:bookmarkEnd w:id="3"/>
+      <w:r>
+        <w:rPr>
+          <w:b/>
+          <w:bCs/>
+        </w:rPr>
+        <w:t>Instructor</w:t>
+      </w:r>
+      <w:r>
+        <w:t>: Dr. Ben Murphy</w:t>
+      </w:r>
+    </w:p>
+    <w:p>
+      <w:pPr>
+        <w:pStyle w:val="BodyText"/>
+      </w:pPr>
+      <w:bookmarkStart w:id="5" w:name="office-hours"/>
+      <w:bookmarkEnd w:id="4"/>
+      <w:r>
+        <w:rPr>
+          <w:b/>
+          <w:bCs/>
+        </w:rPr>
+        <w:t>Email</w:t>
+      </w:r>
+      <w:r>
+        <w:t>: murphy@math.utah.edu</w:t>
+      </w:r>
+    </w:p>
+    <w:p>
+      <w:pPr>
+        <w:pStyle w:val="BodyText"/>
+      </w:pPr>
+      <w:r>
+        <w:rPr>
+          <w:b/>
+          <w:bCs/>
+        </w:rPr>
+        <w:t>Office Hours</w:t>
+      </w:r>
+      <w:r>
+        <w:t xml:space="preserve">: </w:t>
+      </w:r>
+      <w:r>
+        <w:t>Virtual via Microsoft Teams</w:t>
+      </w:r>
+      <w:r>
+        <w:t xml:space="preserve"> (TBD)</w:t>
+      </w:r>
+    </w:p>
+    <w:p>
+      <w:r>
+        <w:rPr>
+          <w:noProof/>
+        </w:rPr>
+        <w:pict w14:anchorId="595A6978">
+          <v:rect id="_x0000_i1047" alt="" style="width:468pt;height:.05pt;mso-width-percent:0;mso-height-percent:0;mso-width-percent:0;mso-height-percent:0" o:hralign="center" o:hrstd="t" o:hr="t"/>
+        </w:pict>
+      </w:r>
+    </w:p>
+    <w:p>
+      <w:pPr>
         <w:pStyle w:val="Heading1"/>
       </w:pPr>
-      <w:bookmarkStart w:id="0" w:name="math-6960-phys-6960-me-en-6960"/>
-      <w:r>
-        <w:t>MATH 6960 / PHYS 6960 / ME EN 6960</w:t>
-      </w:r>
-    </w:p>
-    <w:p>
-      <w:pPr>
-        <w:pStyle w:val="Heading2"/>
-      </w:pPr>
-      <w:bookmarkStart w:id="1" w:name="X38fac15fd08999e775f504954955f52e4a5de78"/>
-      <w:r>
-        <w:t>Special Topics: AI Acceleration for Research, Teaching, and Scientific Communication</w:t>
-      </w:r>
-    </w:p>
-    <w:p>
-      <w:pPr>
-        <w:pStyle w:val="Heading3"/>
-      </w:pPr>
-      <w:bookmarkStart w:id="2" w:name="semester"/>
-      <w:r>
-        <w:t>Semester</w:t>
-      </w:r>
-    </w:p>
-    <w:p>
-      <w:pPr>
-        <w:pStyle w:val="FirstParagraph"/>
-      </w:pPr>
-      <w:r>
-        <w:t>Fall 2027 (Example)</w:t>
-      </w:r>
-    </w:p>
-    <w:p>
-      <w:pPr>
-        <w:pStyle w:val="Heading3"/>
-      </w:pPr>
-      <w:bookmarkStart w:id="3" w:name="credits"/>
-      <w:bookmarkEnd w:id="2"/>
-      <w:r>
-        <w:t>Credits</w:t>
-      </w:r>
-    </w:p>
-    <w:p>
-      <w:pPr>
-        <w:pStyle w:val="FirstParagraph"/>
-      </w:pPr>
-      <w:r>
-        <w:t>3 Graduate Credit Hours</w:t>
-      </w:r>
-    </w:p>
-    <w:p>
-      <w:pPr>
-        <w:pStyle w:val="Heading3"/>
-      </w:pPr>
-      <w:bookmarkStart w:id="4" w:name="modality"/>
-      <w:bookmarkEnd w:id="3"/>
-      <w:r>
-        <w:t>Modality</w:t>
-      </w:r>
-    </w:p>
-    <w:p>
-      <w:pPr>
-        <w:pStyle w:val="FirstParagraph"/>
-      </w:pPr>
-      <w:r>
-        <w:t>Online Synchronous via Microsoft Teams</w:t>
-      </w:r>
-    </w:p>
-    <w:p>
-      <w:pPr>
-        <w:pStyle w:val="Heading3"/>
-      </w:pPr>
-      <w:bookmarkStart w:id="5" w:name="meeting-time"/>
-      <w:bookmarkEnd w:id="4"/>
-      <w:r>
-        <w:t>Meeting Time</w:t>
-      </w:r>
-    </w:p>
-    <w:p>
-      <w:pPr>
-        <w:pStyle w:val="FirstParagraph"/>
-      </w:pPr>
-      <w:r>
-        <w:t>TBD</w:t>
-      </w:r>
-    </w:p>
-    <w:p>
-      <w:pPr>
-        <w:pStyle w:val="Heading3"/>
-      </w:pPr>
-      <w:bookmarkStart w:id="6" w:name="instructor"/>
-      <w:bookmarkEnd w:id="5"/>
-      <w:r>
-        <w:t>Instructor</w:t>
-      </w:r>
-    </w:p>
-    <w:p>
-      <w:pPr>
-        <w:pStyle w:val="FirstParagraph"/>
-      </w:pPr>
-      <w:r>
-        <w:t>TBD</w:t>
-      </w:r>
-    </w:p>
-    <w:p>
-      <w:pPr>
-        <w:pStyle w:val="Heading3"/>
-      </w:pPr>
-      <w:bookmarkStart w:id="7" w:name="office-hours"/>
-      <w:bookmarkEnd w:id="6"/>
-      <w:r>
-        <w:t>Office Hours</w:t>
-      </w:r>
-    </w:p>
-    <w:p>
-      <w:pPr>
-        <w:pStyle w:val="FirstParagraph"/>
-      </w:pPr>
-      <w:r>
-        <w:t>Virtual via Microsoft Teams</w:t>
-      </w:r>
-    </w:p>
-    <w:p>
-      <w:r>
-        <w:pict w14:anchorId="6CCD9607">
-          <v:rect id="_x0000_i1025" style="width:0;height:1.5pt" o:hralign="center" o:hrstd="t" o:hr="t"/>
-        </w:pict>
-      </w:r>
-    </w:p>
-    <w:p>
-      <w:pPr>
-        <w:pStyle w:val="Heading1"/>
-      </w:pPr>
-      <w:bookmarkStart w:id="8" w:name="course-description"/>
+      <w:bookmarkStart w:id="6" w:name="course-description"/>
       <w:bookmarkEnd w:id="0"/>
       <w:bookmarkEnd w:id="1"/>
+      <w:bookmarkEnd w:id="5"/>
+      <w:r>
+        <w:t>Course Description</w:t>
+      </w:r>
+    </w:p>
+    <w:p>
+      <w:pPr>
+        <w:pStyle w:val="FirstParagraph"/>
+      </w:pPr>
+      <w:r>
+        <w:t>This graduate-level special topics course explores the responsible use of Artificial Intelligence (AI) to accelerate research, teaching, scientific communication, and professional development in mathematics, physics, engineering, and related disciplines.</w:t>
+      </w:r>
+    </w:p>
+    <w:p>
+      <w:pPr>
+        <w:pStyle w:val="BodyText"/>
+      </w:pPr>
+      <w:r>
+        <w:t>Students and faculty will learn how to leverage institutionally supported technologies including Microsoft 365, Microsoft Copilot, and ChatGPT Edu alongside scientific tools such as Python, MATLAB, Maple, LaTeX, and Overleaf.</w:t>
+      </w:r>
+    </w:p>
+    <w:p>
+      <w:pPr>
+        <w:pStyle w:val="BodyText"/>
+      </w:pPr>
+      <w:r>
+        <w:t>The course emphasizes research productivity, scientific rigor, academic integrity, and compliance with University of Utah policies while developing practical workflows for scholarly activities including:</w:t>
+      </w:r>
+    </w:p>
+    <w:p>
+      <w:pPr>
+        <w:pStyle w:val="Compact"/>
+        <w:numPr>
+          <w:ilvl w:val="0"/>
+          <w:numId w:val="2"/>
+        </w:numPr>
+      </w:pPr>
+      <w:r>
+        <w:t>Literature reviews</w:t>
+      </w:r>
+    </w:p>
+    <w:p>
+      <w:pPr>
+        <w:pStyle w:val="Compact"/>
+        <w:numPr>
+          <w:ilvl w:val="0"/>
+          <w:numId w:val="2"/>
+        </w:numPr>
+      </w:pPr>
+      <w:r>
+        <w:t>Scientific writing</w:t>
+      </w:r>
+    </w:p>
+    <w:p>
+      <w:pPr>
+        <w:pStyle w:val="Compact"/>
+        <w:numPr>
+          <w:ilvl w:val="0"/>
+          <w:numId w:val="2"/>
+        </w:numPr>
+      </w:pPr>
+      <w:r>
+        <w:t>Journal publications</w:t>
+      </w:r>
+    </w:p>
+    <w:p>
+      <w:pPr>
+        <w:pStyle w:val="Compact"/>
+        <w:numPr>
+          <w:ilvl w:val="0"/>
+          <w:numId w:val="2"/>
+        </w:numPr>
+      </w:pPr>
+      <w:r>
+        <w:t>Grant proposals</w:t>
+      </w:r>
+    </w:p>
+    <w:p>
+      <w:pPr>
+        <w:pStyle w:val="Compact"/>
+        <w:numPr>
+          <w:ilvl w:val="0"/>
+          <w:numId w:val="2"/>
+        </w:numPr>
+      </w:pPr>
+      <w:r>
+        <w:t>Conference presentations</w:t>
+      </w:r>
+    </w:p>
+    <w:p>
+      <w:pPr>
+        <w:pStyle w:val="Compact"/>
+        <w:numPr>
+          <w:ilvl w:val="0"/>
+          <w:numId w:val="2"/>
+        </w:numPr>
+      </w:pPr>
+      <w:r>
+        <w:t>Teaching materials</w:t>
+      </w:r>
+    </w:p>
+    <w:p>
+      <w:pPr>
+        <w:pStyle w:val="Compact"/>
+        <w:numPr>
+          <w:ilvl w:val="0"/>
+          <w:numId w:val="2"/>
+        </w:numPr>
+      </w:pPr>
+      <w:r>
+        <w:t>Academic portfolios</w:t>
+      </w:r>
+    </w:p>
+    <w:p>
+      <w:pPr>
+        <w:pStyle w:val="Compact"/>
+        <w:numPr>
+          <w:ilvl w:val="0"/>
+          <w:numId w:val="2"/>
+        </w:numPr>
+      </w:pPr>
+      <w:r>
+        <w:t>Computational research workflows</w:t>
+      </w:r>
+    </w:p>
+    <w:p>
+      <w:pPr>
+        <w:pStyle w:val="FirstParagraph"/>
+      </w:pPr>
+      <w:r>
+        <w:t>No prior software engineering experience is assumed.</w:t>
+      </w:r>
+    </w:p>
+    <w:p>
+      <w:r>
+        <w:rPr>
+          <w:noProof/>
+        </w:rPr>
+        <w:pict w14:anchorId="4537BC72">
+          <v:rect id="_x0000_i1046" alt="" style="width:468pt;height:.05pt;mso-width-percent:0;mso-height-percent:0;mso-width-percent:0;mso-height-percent:0" o:hralign="center" o:hrstd="t" o:hr="t"/>
+        </w:pict>
+      </w:r>
+    </w:p>
+    <w:p>
+      <w:pPr>
+        <w:pStyle w:val="Heading1"/>
+      </w:pPr>
+      <w:bookmarkStart w:id="7" w:name="course-learning-outcomes"/>
+      <w:bookmarkEnd w:id="6"/>
+      <w:r>
+        <w:lastRenderedPageBreak/>
+        <w:t>Course Learning Outcomes</w:t>
+      </w:r>
+    </w:p>
+    <w:p>
+      <w:pPr>
+        <w:pStyle w:val="FirstParagraph"/>
+      </w:pPr>
+      <w:r>
+        <w:t>Upon successful completion of this course, students will be able to:</w:t>
+      </w:r>
+    </w:p>
+    <w:p>
+      <w:pPr>
+        <w:numPr>
+          <w:ilvl w:val="0"/>
+          <w:numId w:val="3"/>
+        </w:numPr>
+      </w:pPr>
+      <w:r>
+        <w:t>Apply AI tools responsibly in academic research environments.</w:t>
+      </w:r>
+    </w:p>
+    <w:p>
+      <w:pPr>
+        <w:numPr>
+          <w:ilvl w:val="0"/>
+          <w:numId w:val="3"/>
+        </w:numPr>
+      </w:pPr>
+      <w:r>
+        <w:t>Evaluate AI-generated outputs for accuracy, validity, and scholarly integrity.</w:t>
+      </w:r>
+    </w:p>
+    <w:p>
+      <w:pPr>
+        <w:numPr>
+          <w:ilvl w:val="0"/>
+          <w:numId w:val="3"/>
+        </w:numPr>
+      </w:pPr>
+      <w:r>
+        <w:t>Develop AI-assisted workflows for literature reviews and research planning.</w:t>
+      </w:r>
+    </w:p>
+    <w:p>
+      <w:pPr>
+        <w:numPr>
+          <w:ilvl w:val="0"/>
+          <w:numId w:val="3"/>
+        </w:numPr>
+      </w:pPr>
+      <w:r>
+        <w:t>Create professional-quality LaTeX documents using AI-assisted authoring methods.</w:t>
+      </w:r>
+    </w:p>
+    <w:p>
+      <w:pPr>
+        <w:numPr>
+          <w:ilvl w:val="0"/>
+          <w:numId w:val="3"/>
+        </w:numPr>
+      </w:pPr>
+      <w:r>
+        <w:t>Generate publication-quality figures and visualizations using Python, MATLAB, and AI tools.</w:t>
+      </w:r>
+    </w:p>
+    <w:p>
+      <w:pPr>
+        <w:numPr>
+          <w:ilvl w:val="0"/>
+          <w:numId w:val="3"/>
+        </w:numPr>
+      </w:pPr>
+      <w:r>
+        <w:t>Draft journal manuscripts, grant proposals, reviewer responses, research statements, and teaching statements.</w:t>
+      </w:r>
+    </w:p>
+    <w:p>
+      <w:pPr>
+        <w:numPr>
+          <w:ilvl w:val="0"/>
+          <w:numId w:val="3"/>
+        </w:numPr>
+      </w:pPr>
+      <w:r>
+        <w:t>Develop AI-assisted instructional materials including lectures, assignments, quizzes, and assessments.</w:t>
+      </w:r>
+    </w:p>
+    <w:p>
+      <w:pPr>
+        <w:numPr>
+          <w:ilvl w:val="0"/>
+          <w:numId w:val="3"/>
+        </w:numPr>
+      </w:pPr>
+      <w:r>
+        <w:t>Create and maintain a professional academic website and research portfolio.</w:t>
+      </w:r>
+    </w:p>
+    <w:p>
+      <w:pPr>
+        <w:numPr>
+          <w:ilvl w:val="0"/>
+          <w:numId w:val="3"/>
+        </w:numPr>
+      </w:pPr>
+      <w:r>
+        <w:t>Utilize Microsoft Copilot, ChatGPT Edu, and related tools within University-supported environments.</w:t>
+      </w:r>
+    </w:p>
+    <w:p>
+      <w:pPr>
+        <w:numPr>
+          <w:ilvl w:val="0"/>
+          <w:numId w:val="3"/>
+        </w:numPr>
+      </w:pPr>
+      <w:r>
+        <w:t>Construct a personalized AI Research Acceleration Portfolio suitable for continued academic and professional use.</w:t>
+      </w:r>
+    </w:p>
+    <w:p>
+      <w:r>
+        <w:rPr>
+          <w:noProof/>
+        </w:rPr>
+        <w:pict w14:anchorId="6916B91C">
+          <v:rect id="_x0000_i1045" alt="" style="width:468pt;height:.05pt;mso-width-percent:0;mso-height-percent:0;mso-width-percent:0;mso-height-percent:0" o:hralign="center" o:hrstd="t" o:hr="t"/>
+        </w:pict>
+      </w:r>
+    </w:p>
+    <w:p>
+      <w:pPr>
+        <w:pStyle w:val="Heading1"/>
+      </w:pPr>
+      <w:bookmarkStart w:id="8" w:name="required-technology"/>
       <w:bookmarkEnd w:id="7"/>
       <w:r>
-        <w:t>Course Description</w:t>
+        <w:t>Required Technology</w:t>
       </w:r>
     </w:p>
     <w:p>
@@ -151,7 +423,363 @@
         <w:pStyle w:val="FirstParagraph"/>
       </w:pPr>
       <w:r>
-        <w:t>This graduate-level special topics course explores the responsible use of Artificial Intelligence (AI) to accelerate research, teaching, scientific communication, and professional development in mathematics, physics, engineering, and related disciplines.</w:t>
+        <w:t>Students will need access to:</w:t>
+      </w:r>
+    </w:p>
+    <w:p>
+      <w:pPr>
+        <w:pStyle w:val="Compact"/>
+        <w:numPr>
+          <w:ilvl w:val="0"/>
+          <w:numId w:val="4"/>
+        </w:numPr>
+      </w:pPr>
+      <w:r>
+        <w:t>Canvas</w:t>
+      </w:r>
+    </w:p>
+    <w:p>
+      <w:pPr>
+        <w:pStyle w:val="Compact"/>
+        <w:numPr>
+          <w:ilvl w:val="0"/>
+          <w:numId w:val="4"/>
+        </w:numPr>
+      </w:pPr>
+      <w:r>
+        <w:t>Microsoft Copilot</w:t>
+      </w:r>
+    </w:p>
+    <w:p>
+      <w:pPr>
+        <w:pStyle w:val="Compact"/>
+        <w:numPr>
+          <w:ilvl w:val="0"/>
+          <w:numId w:val="4"/>
+        </w:numPr>
+      </w:pPr>
+      <w:r>
+        <w:t>ChatGPT Edu</w:t>
+      </w:r>
+    </w:p>
+    <w:p>
+      <w:pPr>
+        <w:pStyle w:val="Compact"/>
+        <w:numPr>
+          <w:ilvl w:val="0"/>
+          <w:numId w:val="4"/>
+        </w:numPr>
+      </w:pPr>
+      <w:r>
+        <w:t>Overleaf</w:t>
+      </w:r>
+    </w:p>
+    <w:p>
+      <w:pPr>
+        <w:pStyle w:val="Compact"/>
+        <w:numPr>
+          <w:ilvl w:val="0"/>
+          <w:numId w:val="4"/>
+        </w:numPr>
+      </w:pPr>
+      <w:r>
+        <w:t>Python</w:t>
+      </w:r>
+    </w:p>
+    <w:p>
+      <w:pPr>
+        <w:pStyle w:val="Compact"/>
+        <w:numPr>
+          <w:ilvl w:val="0"/>
+          <w:numId w:val="4"/>
+        </w:numPr>
+      </w:pPr>
+      <w:r>
+        <w:t>MATLAB (recommended)</w:t>
+      </w:r>
+    </w:p>
+    <w:p>
+      <w:pPr>
+        <w:pStyle w:val="Compact"/>
+        <w:numPr>
+          <w:ilvl w:val="0"/>
+          <w:numId w:val="4"/>
+        </w:numPr>
+      </w:pPr>
+      <w:r>
+        <w:t>Maple (recommended)</w:t>
+      </w:r>
+    </w:p>
+    <w:p>
+      <w:pPr>
+        <w:pStyle w:val="FirstParagraph"/>
+      </w:pPr>
+      <w:r>
+        <w:t>Preferred Platform:</w:t>
+      </w:r>
+    </w:p>
+    <w:p>
+      <w:pPr>
+        <w:pStyle w:val="Compact"/>
+        <w:numPr>
+          <w:ilvl w:val="0"/>
+          <w:numId w:val="5"/>
+        </w:numPr>
+      </w:pPr>
+      <w:r>
+        <w:t>macOS</w:t>
+      </w:r>
+    </w:p>
+    <w:p>
+      <w:pPr>
+        <w:pStyle w:val="FirstParagraph"/>
+      </w:pPr>
+      <w:r>
+        <w:lastRenderedPageBreak/>
+        <w:t>Supported Platforms:</w:t>
+      </w:r>
+    </w:p>
+    <w:p>
+      <w:pPr>
+        <w:pStyle w:val="Compact"/>
+        <w:numPr>
+          <w:ilvl w:val="0"/>
+          <w:numId w:val="6"/>
+        </w:numPr>
+      </w:pPr>
+      <w:r>
+        <w:t>Windows</w:t>
+      </w:r>
+    </w:p>
+    <w:p>
+      <w:pPr>
+        <w:pStyle w:val="Compact"/>
+        <w:numPr>
+          <w:ilvl w:val="0"/>
+          <w:numId w:val="6"/>
+        </w:numPr>
+      </w:pPr>
+      <w:r>
+        <w:t>Linux</w:t>
+      </w:r>
+    </w:p>
+    <w:p>
+      <w:pPr>
+        <w:pStyle w:val="FirstParagraph"/>
+      </w:pPr>
+      <w:r>
+        <w:t>No prior programming or software engineering experience is required.</w:t>
+      </w:r>
+    </w:p>
+    <w:p>
+      <w:r>
+        <w:rPr>
+          <w:noProof/>
+        </w:rPr>
+        <w:pict w14:anchorId="3A355A27">
+          <v:rect id="_x0000_i1044" alt="" style="width:468pt;height:.05pt;mso-width-percent:0;mso-height-percent:0;mso-width-percent:0;mso-height-percent:0" o:hralign="center" o:hrstd="t" o:hr="t"/>
+        </w:pict>
+      </w:r>
+    </w:p>
+    <w:p>
+      <w:pPr>
+        <w:pStyle w:val="Heading1"/>
+      </w:pPr>
+      <w:bookmarkStart w:id="9" w:name="course-structure"/>
+      <w:bookmarkEnd w:id="8"/>
+      <w:r>
+        <w:t>Course Structure</w:t>
+      </w:r>
+    </w:p>
+    <w:p>
+      <w:pPr>
+        <w:pStyle w:val="FirstParagraph"/>
+      </w:pPr>
+      <w:r>
+        <w:t>Each weekly class session will generally consist of:</w:t>
+      </w:r>
+    </w:p>
+    <w:p>
+      <w:pPr>
+        <w:pStyle w:val="Compact"/>
+        <w:numPr>
+          <w:ilvl w:val="0"/>
+          <w:numId w:val="7"/>
+        </w:numPr>
+      </w:pPr>
+      <w:r>
+        <w:t>Lecture and discussion</w:t>
+      </w:r>
+    </w:p>
+    <w:p>
+      <w:pPr>
+        <w:pStyle w:val="Compact"/>
+        <w:numPr>
+          <w:ilvl w:val="0"/>
+          <w:numId w:val="7"/>
+        </w:numPr>
+      </w:pPr>
+      <w:r>
+        <w:t>Live demonstrations</w:t>
+      </w:r>
+    </w:p>
+    <w:p>
+      <w:pPr>
+        <w:pStyle w:val="Compact"/>
+        <w:numPr>
+          <w:ilvl w:val="0"/>
+          <w:numId w:val="7"/>
+        </w:numPr>
+      </w:pPr>
+      <w:r>
+        <w:t>Interactive workshops</w:t>
+      </w:r>
+    </w:p>
+    <w:p>
+      <w:pPr>
+        <w:pStyle w:val="Compact"/>
+        <w:numPr>
+          <w:ilvl w:val="0"/>
+          <w:numId w:val="7"/>
+        </w:numPr>
+      </w:pPr>
+      <w:r>
+        <w:t>Microsoft Whiteboard collaboration</w:t>
+      </w:r>
+    </w:p>
+    <w:p>
+      <w:pPr>
+        <w:pStyle w:val="Compact"/>
+        <w:numPr>
+          <w:ilvl w:val="0"/>
+          <w:numId w:val="7"/>
+        </w:numPr>
+      </w:pPr>
+      <w:r>
+        <w:t>Portfolio development activities</w:t>
+      </w:r>
+    </w:p>
+    <w:p>
+      <w:pPr>
+        <w:pStyle w:val="FirstParagraph"/>
+      </w:pPr>
+      <w:r>
+        <w:t>All class sessions will be recorded and made available through Microsoft Teams.</w:t>
+      </w:r>
+    </w:p>
+    <w:p>
+      <w:r>
+        <w:rPr>
+          <w:noProof/>
+        </w:rPr>
+        <w:pict w14:anchorId="65BE5A96">
+          <v:rect id="_x0000_i1043" alt="" style="width:468pt;height:.05pt;mso-width-percent:0;mso-height-percent:0;mso-width-percent:0;mso-height-percent:0" o:hralign="center" o:hrstd="t" o:hr="t"/>
+        </w:pict>
+      </w:r>
+    </w:p>
+    <w:p>
+      <w:pPr>
+        <w:pStyle w:val="Heading1"/>
+      </w:pPr>
+      <w:bookmarkStart w:id="10" w:name="major-assignments"/>
+      <w:bookmarkEnd w:id="9"/>
+      <w:r>
+        <w:t>Assignments</w:t>
+      </w:r>
+      <w:r>
+        <w:t xml:space="preserve"> and</w:t>
+      </w:r>
+      <w:bookmarkStart w:id="11" w:name="final-presentation"/>
+      <w:r>
+        <w:t xml:space="preserve"> </w:t>
+      </w:r>
+      <w:r>
+        <w:t>Presentation</w:t>
+      </w:r>
+      <w:r>
+        <w:t>s</w:t>
+      </w:r>
+    </w:p>
+    <w:p>
+      <w:pPr>
+        <w:pStyle w:val="FirstParagraph"/>
+        <w:rPr>
+          <w:rFonts w:ascii="Times New Roman" w:hAnsi="Times New Roman" w:cs="Times New Roman"/>
+          <w:sz w:val="22"/>
+          <w:szCs w:val="22"/>
+        </w:rPr>
+      </w:pPr>
+      <w:r>
+        <w:rPr>
+          <w:rFonts w:ascii="Times New Roman" w:hAnsi="Times New Roman" w:cs="Times New Roman"/>
+          <w:sz w:val="22"/>
+          <w:szCs w:val="22"/>
+        </w:rPr>
+        <w:t>H</w:t>
+      </w:r>
+      <w:r>
+        <w:rPr>
+          <w:rFonts w:ascii="Times New Roman" w:hAnsi="Times New Roman" w:cs="Times New Roman"/>
+          <w:sz w:val="22"/>
+          <w:szCs w:val="22"/>
+        </w:rPr>
+        <w:t>omework will be assigned and expected to be done.</w:t>
+      </w:r>
+      <w:r>
+        <w:rPr>
+          <w:rFonts w:ascii="Times New Roman" w:hAnsi="Times New Roman" w:cs="Times New Roman"/>
+          <w:sz w:val="22"/>
+          <w:szCs w:val="22"/>
+        </w:rPr>
+        <w:br/>
+        <w:t>Results of individual and group projects will be turned in and/or presented</w:t>
+      </w:r>
+      <w:r>
+        <w:rPr>
+          <w:rFonts w:ascii="Times New Roman" w:hAnsi="Times New Roman" w:cs="Times New Roman"/>
+          <w:sz w:val="22"/>
+          <w:szCs w:val="22"/>
+        </w:rPr>
+        <w:br/>
+        <w:t>The final deliverable of the class will be a public GitHub repository comprised of all the project results</w:t>
+      </w:r>
+    </w:p>
+    <w:p>
+      <w:r>
+        <w:rPr>
+          <w:noProof/>
+        </w:rPr>
+        <w:pict w14:anchorId="0C3C69CB">
+          <v:rect id="_x0000_i1042" alt="" style="width:468pt;height:.05pt;mso-width-percent:0;mso-height-percent:0;mso-width-percent:0;mso-height-percent:0" o:hralign="center" o:hrstd="t" o:hr="t"/>
+        </w:pict>
+      </w:r>
+    </w:p>
+    <w:p>
+      <w:pPr>
+        <w:pStyle w:val="Heading1"/>
+      </w:pPr>
+      <w:bookmarkStart w:id="12" w:name="weekly-course-schedule"/>
+      <w:bookmarkEnd w:id="10"/>
+      <w:bookmarkEnd w:id="11"/>
+      <w:r>
+        <w:t>Weekly Course Schedule</w:t>
+      </w:r>
+    </w:p>
+    <w:p>
+      <w:pPr>
+        <w:pStyle w:val="Heading2"/>
+      </w:pPr>
+      <w:bookmarkStart w:id="13" w:name="week-1"/>
+      <w:r>
+        <w:t>Week 1</w:t>
+      </w:r>
+    </w:p>
+    <w:p>
+      <w:pPr>
+        <w:pStyle w:val="FirstParagraph"/>
+      </w:pPr>
+      <w:r>
+        <w:t>Course Introduction and AI Readiness Assessment</w:t>
       </w:r>
     </w:p>
     <w:p>
@@ -159,7 +787,346 @@
         <w:pStyle w:val="BodyText"/>
       </w:pPr>
       <w:r>
-        <w:t>Students and faculty will learn how to leverage institutionally supported technologies including Microsoft 365, Microsoft Copilot, and ChatGPT Edu alongside scientific tools such as Python, MATLAB, Maple, LaTeX, and Overleaf.</w:t>
+        <w:t>Topics:</w:t>
+      </w:r>
+    </w:p>
+    <w:p>
+      <w:pPr>
+        <w:pStyle w:val="Compact"/>
+        <w:numPr>
+          <w:ilvl w:val="0"/>
+          <w:numId w:val="8"/>
+        </w:numPr>
+      </w:pPr>
+      <w:r>
+        <w:t>Course overview</w:t>
+      </w:r>
+    </w:p>
+    <w:p>
+      <w:pPr>
+        <w:pStyle w:val="Compact"/>
+        <w:numPr>
+          <w:ilvl w:val="0"/>
+          <w:numId w:val="8"/>
+        </w:numPr>
+      </w:pPr>
+      <w:r>
+        <w:t>University AI policies</w:t>
+      </w:r>
+    </w:p>
+    <w:p>
+      <w:pPr>
+        <w:pStyle w:val="Compact"/>
+        <w:numPr>
+          <w:ilvl w:val="0"/>
+          <w:numId w:val="8"/>
+        </w:numPr>
+      </w:pPr>
+      <w:r>
+        <w:t>Academic integrity</w:t>
+      </w:r>
+    </w:p>
+    <w:p>
+      <w:pPr>
+        <w:pStyle w:val="Compact"/>
+        <w:numPr>
+          <w:ilvl w:val="0"/>
+          <w:numId w:val="8"/>
+        </w:numPr>
+      </w:pPr>
+      <w:r>
+        <w:t>Overview of various AI models, e.g., ChatGPT</w:t>
+      </w:r>
+      <w:r>
+        <w:t xml:space="preserve"> Edu</w:t>
+      </w:r>
+      <w:r>
+        <w:t xml:space="preserve">, Gemini, </w:t>
+      </w:r>
+      <w:r>
+        <w:t>Claude,</w:t>
+      </w:r>
+      <w:r>
+        <w:t xml:space="preserve"> </w:t>
+      </w:r>
+      <w:r>
+        <w:t>etc.</w:t>
+      </w:r>
+    </w:p>
+    <w:p>
+      <w:pPr>
+        <w:pStyle w:val="Compact"/>
+        <w:numPr>
+          <w:ilvl w:val="0"/>
+          <w:numId w:val="8"/>
+        </w:numPr>
+      </w:pPr>
+      <w:r>
+        <w:lastRenderedPageBreak/>
+        <w:t xml:space="preserve">Overview of various AI interfaces, e.g., M365 Copilot, VSCode, </w:t>
+      </w:r>
+      <w:r>
+        <w:t xml:space="preserve">Cursor, </w:t>
+      </w:r>
+      <w:r>
+        <w:t xml:space="preserve">Claude Desktop, etc. </w:t>
+      </w:r>
+    </w:p>
+    <w:p>
+      <w:pPr>
+        <w:pStyle w:val="Compact"/>
+        <w:numPr>
+          <w:ilvl w:val="0"/>
+          <w:numId w:val="8"/>
+        </w:numPr>
+      </w:pPr>
+      <w:r>
+        <w:t xml:space="preserve">The art of prompt engineering. </w:t>
+      </w:r>
+    </w:p>
+    <w:p>
+      <w:pPr>
+        <w:pStyle w:val="Compact"/>
+        <w:numPr>
+          <w:ilvl w:val="1"/>
+          <w:numId w:val="8"/>
+        </w:numPr>
+      </w:pPr>
+      <w:r>
+        <w:t xml:space="preserve">What </w:t>
+      </w:r>
+      <w:r>
+        <w:t xml:space="preserve">makes </w:t>
+      </w:r>
+      <w:r>
+        <w:t xml:space="preserve">a good prompt? </w:t>
+      </w:r>
+    </w:p>
+    <w:p>
+      <w:pPr>
+        <w:pStyle w:val="Compact"/>
+        <w:numPr>
+          <w:ilvl w:val="1"/>
+          <w:numId w:val="8"/>
+        </w:numPr>
+      </w:pPr>
+      <w:r>
+        <w:t>AI Chat vs AI Agent</w:t>
+      </w:r>
+    </w:p>
+    <w:p>
+      <w:pPr>
+        <w:pStyle w:val="Compact"/>
+        <w:numPr>
+          <w:ilvl w:val="1"/>
+          <w:numId w:val="8"/>
+        </w:numPr>
+      </w:pPr>
+      <w:r>
+        <w:t>Context windows and long term context</w:t>
+      </w:r>
+      <w:r>
+        <w:t xml:space="preserve"> </w:t>
+      </w:r>
+    </w:p>
+    <w:p>
+      <w:pPr>
+        <w:pStyle w:val="Compact"/>
+        <w:numPr>
+          <w:ilvl w:val="0"/>
+          <w:numId w:val="8"/>
+        </w:numPr>
+      </w:pPr>
+      <w:r>
+        <w:t>AI can make you a proficient programmer without knowing programming</w:t>
+      </w:r>
+    </w:p>
+    <w:p>
+      <w:pPr>
+        <w:pStyle w:val="FirstParagraph"/>
+      </w:pPr>
+      <w:r>
+        <w:t>Activities:</w:t>
+      </w:r>
+    </w:p>
+    <w:p>
+      <w:pPr>
+        <w:pStyle w:val="Compact"/>
+        <w:numPr>
+          <w:ilvl w:val="0"/>
+          <w:numId w:val="9"/>
+        </w:numPr>
+      </w:pPr>
+      <w:r>
+        <w:t>Department introductions</w:t>
+      </w:r>
+    </w:p>
+    <w:p>
+      <w:pPr>
+        <w:pStyle w:val="Compact"/>
+        <w:numPr>
+          <w:ilvl w:val="0"/>
+          <w:numId w:val="9"/>
+        </w:numPr>
+      </w:pPr>
+      <w:r>
+        <w:t>Whiteboard ideation session</w:t>
+      </w:r>
+    </w:p>
+    <w:p>
+      <w:pPr>
+        <w:pStyle w:val="Compact"/>
+        <w:numPr>
+          <w:ilvl w:val="1"/>
+          <w:numId w:val="9"/>
+        </w:numPr>
+      </w:pPr>
+      <w:r>
+        <w:t>AI experience assessment</w:t>
+      </w:r>
+    </w:p>
+    <w:p>
+      <w:pPr>
+        <w:pStyle w:val="Compact"/>
+        <w:numPr>
+          <w:ilvl w:val="1"/>
+          <w:numId w:val="9"/>
+        </w:numPr>
+      </w:pPr>
+      <w:r>
+        <w:t xml:space="preserve">AI topic interest </w:t>
+      </w:r>
+      <w:r>
+        <w:t>mapping</w:t>
+      </w:r>
+    </w:p>
+    <w:p>
+      <w:pPr>
+        <w:pStyle w:val="Compact"/>
+        <w:numPr>
+          <w:ilvl w:val="0"/>
+          <w:numId w:val="9"/>
+        </w:numPr>
+      </w:pPr>
+      <w:r>
+        <w:t xml:space="preserve">Create </w:t>
+      </w:r>
+      <w:r>
+        <w:t>M365 Copilot</w:t>
+      </w:r>
+      <w:r>
+        <w:t xml:space="preserve"> Agent and write your first prompt</w:t>
+      </w:r>
+    </w:p>
+    <w:p>
+      <w:pPr>
+        <w:pStyle w:val="Compact"/>
+        <w:numPr>
+          <w:ilvl w:val="0"/>
+          <w:numId w:val="9"/>
+        </w:numPr>
+      </w:pPr>
+      <w:r>
+        <w:t>Create ChatGPT Edu account</w:t>
+      </w:r>
+    </w:p>
+    <w:p>
+      <w:pPr>
+        <w:pStyle w:val="Compact"/>
+        <w:numPr>
+          <w:ilvl w:val="0"/>
+          <w:numId w:val="9"/>
+        </w:numPr>
+      </w:pPr>
+      <w:r>
+        <w:t>Download ChatGPT desktop or Browser sign in</w:t>
+      </w:r>
+    </w:p>
+    <w:p>
+      <w:pPr>
+        <w:pStyle w:val="Compact"/>
+        <w:numPr>
+          <w:ilvl w:val="0"/>
+          <w:numId w:val="9"/>
+        </w:numPr>
+      </w:pPr>
+      <w:r>
+        <w:t>Download VSCode</w:t>
+      </w:r>
+    </w:p>
+    <w:p>
+      <w:pPr>
+        <w:pStyle w:val="Compact"/>
+        <w:numPr>
+          <w:ilvl w:val="0"/>
+          <w:numId w:val="9"/>
+        </w:numPr>
+      </w:pPr>
+      <w:r>
+        <w:t>Connect ChatGPT to VSCode</w:t>
+      </w:r>
+    </w:p>
+    <w:p>
+      <w:pPr>
+        <w:pStyle w:val="Compact"/>
+        <w:numPr>
+          <w:ilvl w:val="0"/>
+          <w:numId w:val="9"/>
+        </w:numPr>
+      </w:pPr>
+      <w:r>
+        <w:t>Create a GitHub account</w:t>
+      </w:r>
+      <w:r>
+        <w:t xml:space="preserve"> and clone your first repository</w:t>
+      </w:r>
+    </w:p>
+    <w:p>
+      <w:pPr>
+        <w:pStyle w:val="Compact"/>
+      </w:pPr>
+      <w:r>
+        <w:t>Homework:</w:t>
+      </w:r>
+    </w:p>
+    <w:p>
+      <w:pPr>
+        <w:pStyle w:val="Compact"/>
+        <w:numPr>
+          <w:ilvl w:val="0"/>
+          <w:numId w:val="9"/>
+        </w:numPr>
+      </w:pPr>
+      <w:r>
+        <w:t xml:space="preserve">Watch 3Blue1Brown LLM and Deep learning series </w:t>
+      </w:r>
+    </w:p>
+    <w:p>
+      <w:r>
+        <w:rPr>
+          <w:noProof/>
+        </w:rPr>
+        <w:pict w14:anchorId="5DCB9D80">
+          <v:rect id="_x0000_i1041" alt="" style="width:468pt;height:.05pt;mso-width-percent:0;mso-height-percent:0;mso-width-percent:0;mso-height-percent:0" o:hralign="center" o:hrstd="t" o:hr="t"/>
+        </w:pict>
+      </w:r>
+    </w:p>
+    <w:p>
+      <w:pPr>
+        <w:pStyle w:val="Heading2"/>
+      </w:pPr>
+      <w:bookmarkStart w:id="14" w:name="week-2"/>
+      <w:bookmarkEnd w:id="13"/>
+      <w:r>
+        <w:t>Week 2</w:t>
+      </w:r>
+    </w:p>
+    <w:p>
+      <w:pPr>
+        <w:pStyle w:val="FirstParagraph"/>
+      </w:pPr>
+      <w:r>
+        <w:t>Building Your AI Research Environment</w:t>
       </w:r>
     </w:p>
     <w:p>
@@ -167,104 +1134,79 @@
         <w:pStyle w:val="BodyText"/>
       </w:pPr>
       <w:r>
-        <w:t>The course emphasizes research productivity, scientific rigor, academic integrity, and compliance with University of Utah policies while developing practical workflows for scholarly activities including:</w:t>
-      </w:r>
-    </w:p>
-    <w:p>
-      <w:pPr>
-        <w:pStyle w:val="Compact"/>
-        <w:numPr>
-          <w:ilvl w:val="0"/>
-          <w:numId w:val="2"/>
-        </w:numPr>
-      </w:pPr>
-      <w:r>
-        <w:t>Literature reviews</w:t>
-      </w:r>
-    </w:p>
-    <w:p>
-      <w:pPr>
-        <w:pStyle w:val="Compact"/>
-        <w:numPr>
-          <w:ilvl w:val="0"/>
-          <w:numId w:val="2"/>
-        </w:numPr>
-      </w:pPr>
-      <w:r>
-        <w:lastRenderedPageBreak/>
-        <w:t>Scientific writing</w:t>
-      </w:r>
-    </w:p>
-    <w:p>
-      <w:pPr>
-        <w:pStyle w:val="Compact"/>
-        <w:numPr>
-          <w:ilvl w:val="0"/>
-          <w:numId w:val="2"/>
-        </w:numPr>
-      </w:pPr>
-      <w:r>
-        <w:t>Journal publications</w:t>
-      </w:r>
-    </w:p>
-    <w:p>
-      <w:pPr>
-        <w:pStyle w:val="Compact"/>
-        <w:numPr>
-          <w:ilvl w:val="0"/>
-          <w:numId w:val="2"/>
-        </w:numPr>
-      </w:pPr>
-      <w:r>
-        <w:t>Grant proposals</w:t>
-      </w:r>
-    </w:p>
-    <w:p>
-      <w:pPr>
-        <w:pStyle w:val="Compact"/>
-        <w:numPr>
-          <w:ilvl w:val="0"/>
-          <w:numId w:val="2"/>
-        </w:numPr>
-      </w:pPr>
-      <w:r>
-        <w:t>Conference presentations</w:t>
-      </w:r>
-    </w:p>
-    <w:p>
-      <w:pPr>
-        <w:pStyle w:val="Compact"/>
-        <w:numPr>
-          <w:ilvl w:val="0"/>
-          <w:numId w:val="2"/>
-        </w:numPr>
-      </w:pPr>
-      <w:r>
-        <w:t>Teaching materials</w:t>
-      </w:r>
-    </w:p>
-    <w:p>
-      <w:pPr>
-        <w:pStyle w:val="Compact"/>
-        <w:numPr>
-          <w:ilvl w:val="0"/>
-          <w:numId w:val="2"/>
-        </w:numPr>
-      </w:pPr>
-      <w:r>
-        <w:t>Academic portfolios</w:t>
-      </w:r>
-    </w:p>
-    <w:p>
-      <w:pPr>
-        <w:pStyle w:val="Compact"/>
-        <w:numPr>
-          <w:ilvl w:val="0"/>
-          <w:numId w:val="2"/>
-        </w:numPr>
-      </w:pPr>
-      <w:r>
-        <w:t>Computational research workflows</w:t>
+        <w:t>Topics:</w:t>
+      </w:r>
+    </w:p>
+    <w:p>
+      <w:pPr>
+        <w:pStyle w:val="Compact"/>
+        <w:numPr>
+          <w:ilvl w:val="0"/>
+          <w:numId w:val="10"/>
+        </w:numPr>
+      </w:pPr>
+      <w:r>
+        <w:t>Microsoft 365</w:t>
+      </w:r>
+    </w:p>
+    <w:p>
+      <w:pPr>
+        <w:pStyle w:val="Compact"/>
+        <w:numPr>
+          <w:ilvl w:val="0"/>
+          <w:numId w:val="10"/>
+        </w:numPr>
+      </w:pPr>
+      <w:r>
+        <w:t>Copilot</w:t>
+      </w:r>
+    </w:p>
+    <w:p>
+      <w:pPr>
+        <w:pStyle w:val="Compact"/>
+        <w:numPr>
+          <w:ilvl w:val="0"/>
+          <w:numId w:val="10"/>
+        </w:numPr>
+      </w:pPr>
+      <w:r>
+        <w:t>ChatGPT Edu</w:t>
+      </w:r>
+    </w:p>
+    <w:p>
+      <w:pPr>
+        <w:pStyle w:val="Compact"/>
+        <w:numPr>
+          <w:ilvl w:val="0"/>
+          <w:numId w:val="10"/>
+        </w:numPr>
+      </w:pPr>
+      <w:r>
+        <w:t>Teams</w:t>
+      </w:r>
+    </w:p>
+    <w:p>
+      <w:pPr>
+        <w:pStyle w:val="Compact"/>
+        <w:numPr>
+          <w:ilvl w:val="0"/>
+          <w:numId w:val="10"/>
+        </w:numPr>
+      </w:pPr>
+      <w:r>
+        <w:t>OneDrive</w:t>
+      </w:r>
+    </w:p>
+    <w:p>
+      <w:pPr>
+        <w:pStyle w:val="Compact"/>
+        <w:numPr>
+          <w:ilvl w:val="0"/>
+          <w:numId w:val="10"/>
+        </w:numPr>
+      </w:pPr>
+      <w:r>
+        <w:t>Overleaf</w:t>
       </w:r>
     </w:p>
     <w:p>
@@ -272,964 +1214,33 @@
         <w:pStyle w:val="FirstParagraph"/>
       </w:pPr>
       <w:r>
-        <w:t>No prior software engineering experience is assumed.</w:t>
-      </w:r>
-    </w:p>
-    <w:p>
-      <w:r>
-        <w:pict w14:anchorId="26018C3F">
-          <v:rect id="_x0000_i1026" style="width:0;height:1.5pt" o:hralign="center" o:hrstd="t" o:hr="t"/>
+        <w:t>Deliverable:</w:t>
+      </w:r>
+    </w:p>
+    <w:p>
+      <w:pPr>
+        <w:pStyle w:val="BodyText"/>
+      </w:pPr>
+      <w:r>
+        <w:t>Personal productivity environment</w:t>
+      </w:r>
+    </w:p>
+    <w:p>
+      <w:r>
+        <w:rPr>
+          <w:noProof/>
+        </w:rPr>
+        <w:pict w14:anchorId="3C79EADD">
+          <v:rect id="_x0000_i1040" alt="" style="width:468pt;height:.05pt;mso-width-percent:0;mso-height-percent:0;mso-width-percent:0;mso-height-percent:0" o:hralign="center" o:hrstd="t" o:hr="t"/>
         </w:pict>
       </w:r>
     </w:p>
     <w:p>
       <w:pPr>
-        <w:pStyle w:val="Heading1"/>
-      </w:pPr>
-      <w:bookmarkStart w:id="9" w:name="course-learning-outcomes"/>
-      <w:bookmarkEnd w:id="8"/>
-      <w:r>
-        <w:t>Course Learning Outcomes</w:t>
-      </w:r>
-    </w:p>
-    <w:p>
-      <w:pPr>
-        <w:pStyle w:val="FirstParagraph"/>
-      </w:pPr>
-      <w:r>
-        <w:t>Upon successful completion of this course, students will be able to:</w:t>
-      </w:r>
-    </w:p>
-    <w:p>
-      <w:pPr>
-        <w:numPr>
-          <w:ilvl w:val="0"/>
-          <w:numId w:val="3"/>
-        </w:numPr>
-      </w:pPr>
-      <w:r>
-        <w:t>Apply AI tools responsibly in academic research environments.</w:t>
-      </w:r>
-    </w:p>
-    <w:p>
-      <w:pPr>
-        <w:numPr>
-          <w:ilvl w:val="0"/>
-          <w:numId w:val="3"/>
-        </w:numPr>
-      </w:pPr>
-      <w:r>
-        <w:t>Evaluate AI-generated outputs for accuracy, validity, and scholarly integrity.</w:t>
-      </w:r>
-    </w:p>
-    <w:p>
-      <w:pPr>
-        <w:numPr>
-          <w:ilvl w:val="0"/>
-          <w:numId w:val="3"/>
-        </w:numPr>
-      </w:pPr>
-      <w:r>
-        <w:t>Develop AI-assisted workflows for literature reviews and research planning.</w:t>
-      </w:r>
-    </w:p>
-    <w:p>
-      <w:pPr>
-        <w:numPr>
-          <w:ilvl w:val="0"/>
-          <w:numId w:val="3"/>
-        </w:numPr>
-      </w:pPr>
-      <w:r>
-        <w:t>Create professional-quality LaTeX documents using AI-assisted authoring methods.</w:t>
-      </w:r>
-    </w:p>
-    <w:p>
-      <w:pPr>
-        <w:numPr>
-          <w:ilvl w:val="0"/>
-          <w:numId w:val="3"/>
-        </w:numPr>
-      </w:pPr>
-      <w:r>
-        <w:t>Generate publication-quality figures and visualizations using Python, MATLAB, and AI tools.</w:t>
-      </w:r>
-    </w:p>
-    <w:p>
-      <w:pPr>
-        <w:numPr>
-          <w:ilvl w:val="0"/>
-          <w:numId w:val="3"/>
-        </w:numPr>
-      </w:pPr>
-      <w:r>
-        <w:t>Draft journal manuscripts, grant proposals, reviewer responses, research statements, and teaching statements.</w:t>
-      </w:r>
-    </w:p>
-    <w:p>
-      <w:pPr>
-        <w:numPr>
-          <w:ilvl w:val="0"/>
-          <w:numId w:val="3"/>
-        </w:numPr>
-      </w:pPr>
-      <w:r>
-        <w:t>Develop AI-assisted instructional materials including lectures, assignments, quizzes, and assessments.</w:t>
-      </w:r>
-    </w:p>
-    <w:p>
-      <w:pPr>
-        <w:numPr>
-          <w:ilvl w:val="0"/>
-          <w:numId w:val="3"/>
-        </w:numPr>
-      </w:pPr>
-      <w:r>
-        <w:t>Create and maintain a professional academic website and research portfolio.</w:t>
-      </w:r>
-    </w:p>
-    <w:p>
-      <w:pPr>
-        <w:numPr>
-          <w:ilvl w:val="0"/>
-          <w:numId w:val="3"/>
-        </w:numPr>
-      </w:pPr>
-      <w:r>
-        <w:t>Utilize Microsoft Copilot, ChatGPT Edu, and related tools within University-supported environments.</w:t>
-      </w:r>
-    </w:p>
-    <w:p>
-      <w:pPr>
-        <w:numPr>
-          <w:ilvl w:val="0"/>
-          <w:numId w:val="3"/>
-        </w:numPr>
-      </w:pPr>
-      <w:r>
-        <w:t>Construct a personalized AI Research Acceleration Portfolio suitable for continued academic and professional use.</w:t>
-      </w:r>
-    </w:p>
-    <w:p>
-      <w:r>
-        <w:pict w14:anchorId="246E108D">
-          <v:rect id="_x0000_i1027" style="width:0;height:1.5pt" o:hralign="center" o:hrstd="t" o:hr="t"/>
-        </w:pict>
-      </w:r>
-    </w:p>
-    <w:p>
-      <w:pPr>
-        <w:pStyle w:val="Heading1"/>
-      </w:pPr>
-      <w:bookmarkStart w:id="10" w:name="required-technology"/>
-      <w:bookmarkEnd w:id="9"/>
-      <w:r>
-        <w:t>Required Technology</w:t>
-      </w:r>
-    </w:p>
-    <w:p>
-      <w:pPr>
-        <w:pStyle w:val="FirstParagraph"/>
-      </w:pPr>
-      <w:r>
-        <w:t>Students will need access to:</w:t>
-      </w:r>
-    </w:p>
-    <w:p>
-      <w:pPr>
-        <w:pStyle w:val="Compact"/>
-        <w:numPr>
-          <w:ilvl w:val="0"/>
-          <w:numId w:val="4"/>
-        </w:numPr>
-      </w:pPr>
-      <w:r>
-        <w:lastRenderedPageBreak/>
-        <w:t>Microsoft 365</w:t>
-      </w:r>
-    </w:p>
-    <w:p>
-      <w:pPr>
-        <w:pStyle w:val="Compact"/>
-        <w:numPr>
-          <w:ilvl w:val="0"/>
-          <w:numId w:val="4"/>
-        </w:numPr>
-      </w:pPr>
-      <w:r>
-        <w:t>Microsoft Teams</w:t>
-      </w:r>
-    </w:p>
-    <w:p>
-      <w:pPr>
-        <w:pStyle w:val="Compact"/>
-        <w:numPr>
-          <w:ilvl w:val="0"/>
-          <w:numId w:val="4"/>
-        </w:numPr>
-      </w:pPr>
-      <w:r>
-        <w:t>Microsoft Whiteboard</w:t>
-      </w:r>
-    </w:p>
-    <w:p>
-      <w:pPr>
-        <w:pStyle w:val="Compact"/>
-        <w:numPr>
-          <w:ilvl w:val="0"/>
-          <w:numId w:val="4"/>
-        </w:numPr>
-      </w:pPr>
-      <w:r>
-        <w:t>Microsoft Copilot</w:t>
-      </w:r>
-    </w:p>
-    <w:p>
-      <w:pPr>
-        <w:pStyle w:val="Compact"/>
-        <w:numPr>
-          <w:ilvl w:val="0"/>
-          <w:numId w:val="4"/>
-        </w:numPr>
-      </w:pPr>
-      <w:r>
-        <w:t>ChatGPT Edu</w:t>
-      </w:r>
-    </w:p>
-    <w:p>
-      <w:pPr>
-        <w:pStyle w:val="Compact"/>
-        <w:numPr>
-          <w:ilvl w:val="0"/>
-          <w:numId w:val="4"/>
-        </w:numPr>
-      </w:pPr>
-      <w:r>
-        <w:t>Overleaf</w:t>
-      </w:r>
-    </w:p>
-    <w:p>
-      <w:pPr>
-        <w:pStyle w:val="Compact"/>
-        <w:numPr>
-          <w:ilvl w:val="0"/>
-          <w:numId w:val="4"/>
-        </w:numPr>
-      </w:pPr>
-      <w:r>
-        <w:t>Python</w:t>
-      </w:r>
-    </w:p>
-    <w:p>
-      <w:pPr>
-        <w:pStyle w:val="Compact"/>
-        <w:numPr>
-          <w:ilvl w:val="0"/>
-          <w:numId w:val="4"/>
-        </w:numPr>
-      </w:pPr>
-      <w:r>
-        <w:t>MATLAB (recommended)</w:t>
-      </w:r>
-    </w:p>
-    <w:p>
-      <w:pPr>
-        <w:pStyle w:val="Compact"/>
-        <w:numPr>
-          <w:ilvl w:val="0"/>
-          <w:numId w:val="4"/>
-        </w:numPr>
-      </w:pPr>
-      <w:r>
-        <w:t>Maple (recommended)</w:t>
-      </w:r>
-    </w:p>
-    <w:p>
-      <w:pPr>
-        <w:pStyle w:val="FirstParagraph"/>
-      </w:pPr>
-      <w:r>
-        <w:t>Preferred Platform:</w:t>
-      </w:r>
-    </w:p>
-    <w:p>
-      <w:pPr>
-        <w:pStyle w:val="Compact"/>
-        <w:numPr>
-          <w:ilvl w:val="0"/>
-          <w:numId w:val="5"/>
-        </w:numPr>
-      </w:pPr>
-      <w:r>
-        <w:t>macOS</w:t>
-      </w:r>
-    </w:p>
-    <w:p>
-      <w:pPr>
-        <w:pStyle w:val="FirstParagraph"/>
-      </w:pPr>
-      <w:r>
-        <w:t>Supported Platforms:</w:t>
-      </w:r>
-    </w:p>
-    <w:p>
-      <w:pPr>
-        <w:pStyle w:val="Compact"/>
-        <w:numPr>
-          <w:ilvl w:val="0"/>
-          <w:numId w:val="6"/>
-        </w:numPr>
-      </w:pPr>
-      <w:r>
-        <w:t>Windows</w:t>
-      </w:r>
-    </w:p>
-    <w:p>
-      <w:pPr>
-        <w:pStyle w:val="Compact"/>
-        <w:numPr>
-          <w:ilvl w:val="0"/>
-          <w:numId w:val="6"/>
-        </w:numPr>
-      </w:pPr>
-      <w:r>
-        <w:t>Linux</w:t>
-      </w:r>
-    </w:p>
-    <w:p>
-      <w:pPr>
-        <w:pStyle w:val="FirstParagraph"/>
-      </w:pPr>
-      <w:r>
-        <w:t>No prior programming or software engineering experience is required.</w:t>
-      </w:r>
-    </w:p>
-    <w:p>
-      <w:r>
-        <w:pict w14:anchorId="2D7DA586">
-          <v:rect id="_x0000_i1028" style="width:0;height:1.5pt" o:hralign="center" o:hrstd="t" o:hr="t"/>
-        </w:pict>
-      </w:r>
-    </w:p>
-    <w:p>
-      <w:pPr>
-        <w:pStyle w:val="Heading1"/>
-      </w:pPr>
-      <w:bookmarkStart w:id="11" w:name="course-structure"/>
-      <w:bookmarkEnd w:id="10"/>
-      <w:r>
-        <w:t>Course Structure</w:t>
-      </w:r>
-    </w:p>
-    <w:p>
-      <w:pPr>
-        <w:pStyle w:val="FirstParagraph"/>
-      </w:pPr>
-      <w:r>
-        <w:t>Each weekly class session will generally consist of:</w:t>
-      </w:r>
-    </w:p>
-    <w:p>
-      <w:pPr>
-        <w:pStyle w:val="Compact"/>
-        <w:numPr>
-          <w:ilvl w:val="0"/>
-          <w:numId w:val="7"/>
-        </w:numPr>
-      </w:pPr>
-      <w:r>
-        <w:t>Lecture and discussion</w:t>
-      </w:r>
-    </w:p>
-    <w:p>
-      <w:pPr>
-        <w:pStyle w:val="Compact"/>
-        <w:numPr>
-          <w:ilvl w:val="0"/>
-          <w:numId w:val="7"/>
-        </w:numPr>
-      </w:pPr>
-      <w:r>
-        <w:t>Live demonstrations</w:t>
-      </w:r>
-    </w:p>
-    <w:p>
-      <w:pPr>
-        <w:pStyle w:val="Compact"/>
-        <w:numPr>
-          <w:ilvl w:val="0"/>
-          <w:numId w:val="7"/>
-        </w:numPr>
-      </w:pPr>
-      <w:r>
-        <w:t>Interactive workshops</w:t>
-      </w:r>
-    </w:p>
-    <w:p>
-      <w:pPr>
-        <w:pStyle w:val="Compact"/>
-        <w:numPr>
-          <w:ilvl w:val="0"/>
-          <w:numId w:val="7"/>
-        </w:numPr>
-      </w:pPr>
-      <w:r>
-        <w:t>Microsoft Whiteboard collaboration</w:t>
-      </w:r>
-    </w:p>
-    <w:p>
-      <w:pPr>
-        <w:pStyle w:val="Compact"/>
-        <w:numPr>
-          <w:ilvl w:val="0"/>
-          <w:numId w:val="7"/>
-        </w:numPr>
-      </w:pPr>
-      <w:r>
-        <w:t>Portfolio development activities</w:t>
-      </w:r>
-    </w:p>
-    <w:p>
-      <w:pPr>
-        <w:pStyle w:val="FirstParagraph"/>
-      </w:pPr>
-      <w:r>
-        <w:t>All class sessions will be recorded and made available through Microsoft Teams.</w:t>
-      </w:r>
-    </w:p>
-    <w:p>
-      <w:r>
-        <w:pict w14:anchorId="4843D747">
-          <v:rect id="_x0000_i1029" style="width:0;height:1.5pt" o:hralign="center" o:hrstd="t" o:hr="t"/>
-        </w:pict>
-      </w:r>
-    </w:p>
-    <w:p>
-      <w:pPr>
-        <w:pStyle w:val="Heading1"/>
-      </w:pPr>
-      <w:bookmarkStart w:id="12" w:name="major-assignments"/>
-      <w:bookmarkEnd w:id="11"/>
-      <w:r>
-        <w:t>Major Assignments</w:t>
-      </w:r>
-    </w:p>
-    <w:p>
-      <w:pPr>
         <w:pStyle w:val="Heading2"/>
       </w:pPr>
-      <w:bookmarkStart w:id="13" w:name="ai-readiness-reflection"/>
-      <w:r>
-        <w:t>AI Readiness Reflection</w:t>
-      </w:r>
-    </w:p>
-    <w:p>
-      <w:pPr>
-        <w:pStyle w:val="FirstParagraph"/>
-      </w:pPr>
-      <w:r>
-        <w:t>5%</w:t>
-      </w:r>
-    </w:p>
-    <w:p>
-      <w:pPr>
-        <w:pStyle w:val="Heading2"/>
-      </w:pPr>
-      <w:bookmarkStart w:id="14" w:name="literature-review-project"/>
-      <w:bookmarkEnd w:id="13"/>
-      <w:r>
-        <w:lastRenderedPageBreak/>
-        <w:t>Literature Review Project</w:t>
-      </w:r>
-    </w:p>
-    <w:p>
-      <w:pPr>
-        <w:pStyle w:val="FirstParagraph"/>
-      </w:pPr>
-      <w:r>
-        <w:t>10%</w:t>
-      </w:r>
-    </w:p>
-    <w:p>
-      <w:pPr>
-        <w:pStyle w:val="Heading2"/>
-      </w:pPr>
-      <w:bookmarkStart w:id="15" w:name="latex-research-document"/>
+      <w:bookmarkStart w:id="15" w:name="week-3"/>
       <w:bookmarkEnd w:id="14"/>
-      <w:r>
-        <w:t>LaTeX Research Document</w:t>
-      </w:r>
-    </w:p>
-    <w:p>
-      <w:pPr>
-        <w:pStyle w:val="FirstParagraph"/>
-      </w:pPr>
-      <w:r>
-        <w:t>10%</w:t>
-      </w:r>
-    </w:p>
-    <w:p>
-      <w:pPr>
-        <w:pStyle w:val="Heading2"/>
-      </w:pPr>
-      <w:bookmarkStart w:id="16" w:name="computational-research-notebook"/>
-      <w:bookmarkEnd w:id="15"/>
-      <w:r>
-        <w:t>Computational Research Notebook</w:t>
-      </w:r>
-    </w:p>
-    <w:p>
-      <w:pPr>
-        <w:pStyle w:val="FirstParagraph"/>
-      </w:pPr>
-      <w:r>
-        <w:t>10%</w:t>
-      </w:r>
-    </w:p>
-    <w:p>
-      <w:pPr>
-        <w:pStyle w:val="Heading2"/>
-      </w:pPr>
-      <w:bookmarkStart w:id="17" w:name="scientific-visualization-portfolio"/>
-      <w:bookmarkEnd w:id="16"/>
-      <w:r>
-        <w:t>Scientific Visualization Portfolio</w:t>
-      </w:r>
-    </w:p>
-    <w:p>
-      <w:pPr>
-        <w:pStyle w:val="FirstParagraph"/>
-      </w:pPr>
-      <w:r>
-        <w:t>10%</w:t>
-      </w:r>
-    </w:p>
-    <w:p>
-      <w:pPr>
-        <w:pStyle w:val="Heading2"/>
-      </w:pPr>
-      <w:bookmarkStart w:id="18" w:name="peer-review-response-exercise"/>
-      <w:bookmarkEnd w:id="17"/>
-      <w:r>
-        <w:t>Peer Review Response Exercise</w:t>
-      </w:r>
-    </w:p>
-    <w:p>
-      <w:pPr>
-        <w:pStyle w:val="FirstParagraph"/>
-      </w:pPr>
-      <w:r>
-        <w:t>5%</w:t>
-      </w:r>
-    </w:p>
-    <w:p>
-      <w:pPr>
-        <w:pStyle w:val="Heading2"/>
-      </w:pPr>
-      <w:bookmarkStart w:id="19" w:name="mini-grant-proposal"/>
-      <w:bookmarkEnd w:id="18"/>
-      <w:r>
-        <w:t>Mini Grant Proposal</w:t>
-      </w:r>
-    </w:p>
-    <w:p>
-      <w:pPr>
-        <w:pStyle w:val="FirstParagraph"/>
-      </w:pPr>
-      <w:r>
-        <w:t>10%</w:t>
-      </w:r>
-    </w:p>
-    <w:p>
-      <w:pPr>
-        <w:pStyle w:val="Heading2"/>
-      </w:pPr>
-      <w:bookmarkStart w:id="20" w:name="teaching-development-module"/>
-      <w:bookmarkEnd w:id="19"/>
-      <w:r>
-        <w:t>Teaching Development Module</w:t>
-      </w:r>
-    </w:p>
-    <w:p>
-      <w:pPr>
-        <w:pStyle w:val="FirstParagraph"/>
-      </w:pPr>
-      <w:r>
-        <w:t>10%</w:t>
-      </w:r>
-    </w:p>
-    <w:p>
-      <w:pPr>
-        <w:pStyle w:val="Heading2"/>
-      </w:pPr>
-      <w:bookmarkStart w:id="21" w:name="professional-academic-portfolio"/>
-      <w:bookmarkEnd w:id="20"/>
-      <w:r>
-        <w:t>Professional Academic Portfolio</w:t>
-      </w:r>
-    </w:p>
-    <w:p>
-      <w:pPr>
-        <w:pStyle w:val="FirstParagraph"/>
-      </w:pPr>
-      <w:r>
-        <w:t>10%</w:t>
-      </w:r>
-    </w:p>
-    <w:p>
-      <w:pPr>
-        <w:pStyle w:val="Heading2"/>
-      </w:pPr>
-      <w:bookmarkStart w:id="22" w:name="ai-research-acceleration-portfolio"/>
-      <w:bookmarkEnd w:id="21"/>
-      <w:r>
-        <w:t>AI Research Acceleration Portfolio</w:t>
-      </w:r>
-    </w:p>
-    <w:p>
-      <w:pPr>
-        <w:pStyle w:val="FirstParagraph"/>
-      </w:pPr>
-      <w:r>
-        <w:t>15%</w:t>
-      </w:r>
-    </w:p>
-    <w:p>
-      <w:pPr>
-        <w:pStyle w:val="Heading2"/>
-      </w:pPr>
-      <w:bookmarkStart w:id="23" w:name="final-presentation"/>
-      <w:bookmarkEnd w:id="22"/>
-      <w:r>
-        <w:t>Final Presentation</w:t>
-      </w:r>
-    </w:p>
-    <w:p>
-      <w:pPr>
-        <w:pStyle w:val="FirstParagraph"/>
-      </w:pPr>
-      <w:r>
-        <w:t>5%</w:t>
-      </w:r>
-    </w:p>
-    <w:p>
-      <w:pPr>
-        <w:pStyle w:val="BodyText"/>
-      </w:pPr>
-      <w:r>
-        <w:t>Total 100%</w:t>
-      </w:r>
-    </w:p>
-    <w:p>
-      <w:r>
-        <w:pict w14:anchorId="6DA69136">
-          <v:rect id="_x0000_i1030" style="width:0;height:1.5pt" o:hralign="center" o:hrstd="t" o:hr="t"/>
-        </w:pict>
-      </w:r>
-    </w:p>
-    <w:p>
-      <w:pPr>
-        <w:pStyle w:val="Heading1"/>
-      </w:pPr>
-      <w:bookmarkStart w:id="24" w:name="weekly-course-schedule"/>
-      <w:bookmarkEnd w:id="12"/>
-      <w:bookmarkEnd w:id="23"/>
-      <w:r>
-        <w:lastRenderedPageBreak/>
-        <w:t>Weekly Course Schedule</w:t>
-      </w:r>
-    </w:p>
-    <w:p>
-      <w:pPr>
-        <w:pStyle w:val="Heading2"/>
-      </w:pPr>
-      <w:bookmarkStart w:id="25" w:name="week-1"/>
-      <w:r>
-        <w:t>Week 1</w:t>
-      </w:r>
-    </w:p>
-    <w:p>
-      <w:pPr>
-        <w:pStyle w:val="FirstParagraph"/>
-      </w:pPr>
-      <w:r>
-        <w:t>Course Introduction and AI Readiness Assessment</w:t>
-      </w:r>
-    </w:p>
-    <w:p>
-      <w:pPr>
-        <w:pStyle w:val="BodyText"/>
-      </w:pPr>
-      <w:r>
-        <w:t>Topics:</w:t>
-      </w:r>
-    </w:p>
-    <w:p>
-      <w:pPr>
-        <w:pStyle w:val="Compact"/>
-        <w:numPr>
-          <w:ilvl w:val="0"/>
-          <w:numId w:val="8"/>
-        </w:numPr>
-      </w:pPr>
-      <w:r>
-        <w:t>Course overview</w:t>
-      </w:r>
-    </w:p>
-    <w:p>
-      <w:pPr>
-        <w:pStyle w:val="Compact"/>
-        <w:numPr>
-          <w:ilvl w:val="0"/>
-          <w:numId w:val="8"/>
-        </w:numPr>
-      </w:pPr>
-      <w:r>
-        <w:t>University AI policies</w:t>
-      </w:r>
-    </w:p>
-    <w:p>
-      <w:pPr>
-        <w:pStyle w:val="Compact"/>
-        <w:numPr>
-          <w:ilvl w:val="0"/>
-          <w:numId w:val="8"/>
-        </w:numPr>
-      </w:pPr>
-      <w:r>
-        <w:t>Academic integrity</w:t>
-      </w:r>
-    </w:p>
-    <w:p>
-      <w:pPr>
-        <w:pStyle w:val="Compact"/>
-        <w:numPr>
-          <w:ilvl w:val="0"/>
-          <w:numId w:val="8"/>
-        </w:numPr>
-      </w:pPr>
-      <w:r>
-        <w:t>Microsoft Whiteboard onboarding</w:t>
-      </w:r>
-    </w:p>
-    <w:p>
-      <w:pPr>
-        <w:pStyle w:val="FirstParagraph"/>
-      </w:pPr>
-      <w:r>
-        <w:t>Activities:</w:t>
-      </w:r>
-    </w:p>
-    <w:p>
-      <w:pPr>
-        <w:pStyle w:val="Compact"/>
-        <w:numPr>
-          <w:ilvl w:val="0"/>
-          <w:numId w:val="9"/>
-        </w:numPr>
-      </w:pPr>
-      <w:r>
-        <w:t>Department introductions</w:t>
-      </w:r>
-    </w:p>
-    <w:p>
-      <w:pPr>
-        <w:pStyle w:val="Compact"/>
-        <w:numPr>
-          <w:ilvl w:val="0"/>
-          <w:numId w:val="9"/>
-        </w:numPr>
-      </w:pPr>
-      <w:r>
-        <w:t>AI experience assessment</w:t>
-      </w:r>
-    </w:p>
-    <w:p>
-      <w:pPr>
-        <w:pStyle w:val="Compact"/>
-        <w:numPr>
-          <w:ilvl w:val="0"/>
-          <w:numId w:val="9"/>
-        </w:numPr>
-      </w:pPr>
-      <w:r>
-        <w:t>Research interest mapping</w:t>
-      </w:r>
-    </w:p>
-    <w:p>
-      <w:pPr>
-        <w:pStyle w:val="Compact"/>
-        <w:numPr>
-          <w:ilvl w:val="0"/>
-          <w:numId w:val="9"/>
-        </w:numPr>
-      </w:pPr>
-      <w:r>
-        <w:t>Whiteboard ideation session</w:t>
-      </w:r>
-    </w:p>
-    <w:p>
-      <w:pPr>
-        <w:pStyle w:val="Compact"/>
-        <w:numPr>
-          <w:ilvl w:val="0"/>
-          <w:numId w:val="9"/>
-        </w:numPr>
-      </w:pPr>
-      <w:r>
-        <w:t>Needs assessment survey</w:t>
-      </w:r>
-    </w:p>
-    <w:p>
-      <w:pPr>
-        <w:pStyle w:val="FirstParagraph"/>
-      </w:pPr>
-      <w:r>
-        <w:t>Deliverable:</w:t>
-      </w:r>
-    </w:p>
-    <w:p>
-      <w:pPr>
-        <w:pStyle w:val="BodyText"/>
-      </w:pPr>
-      <w:r>
-        <w:t>AI Readiness Reflection</w:t>
-      </w:r>
-    </w:p>
-    <w:p>
-      <w:r>
-        <w:pict w14:anchorId="2A1DBD54">
-          <v:rect id="_x0000_i1031" style="width:0;height:1.5pt" o:hralign="center" o:hrstd="t" o:hr="t"/>
-        </w:pict>
-      </w:r>
-    </w:p>
-    <w:p>
-      <w:pPr>
-        <w:pStyle w:val="Heading2"/>
-      </w:pPr>
-      <w:bookmarkStart w:id="26" w:name="week-2"/>
-      <w:bookmarkEnd w:id="25"/>
-      <w:r>
-        <w:t>Week 2</w:t>
-      </w:r>
-    </w:p>
-    <w:p>
-      <w:pPr>
-        <w:pStyle w:val="FirstParagraph"/>
-      </w:pPr>
-      <w:r>
-        <w:t>Building Your AI Research Environment</w:t>
-      </w:r>
-    </w:p>
-    <w:p>
-      <w:pPr>
-        <w:pStyle w:val="BodyText"/>
-      </w:pPr>
-      <w:r>
-        <w:t>Topics:</w:t>
-      </w:r>
-    </w:p>
-    <w:p>
-      <w:pPr>
-        <w:pStyle w:val="Compact"/>
-        <w:numPr>
-          <w:ilvl w:val="0"/>
-          <w:numId w:val="10"/>
-        </w:numPr>
-      </w:pPr>
-      <w:r>
-        <w:t>Microsoft 365</w:t>
-      </w:r>
-    </w:p>
-    <w:p>
-      <w:pPr>
-        <w:pStyle w:val="Compact"/>
-        <w:numPr>
-          <w:ilvl w:val="0"/>
-          <w:numId w:val="10"/>
-        </w:numPr>
-      </w:pPr>
-      <w:r>
-        <w:t>Copilot</w:t>
-      </w:r>
-    </w:p>
-    <w:p>
-      <w:pPr>
-        <w:pStyle w:val="Compact"/>
-        <w:numPr>
-          <w:ilvl w:val="0"/>
-          <w:numId w:val="10"/>
-        </w:numPr>
-      </w:pPr>
-      <w:r>
-        <w:t>ChatGPT Edu</w:t>
-      </w:r>
-    </w:p>
-    <w:p>
-      <w:pPr>
-        <w:pStyle w:val="Compact"/>
-        <w:numPr>
-          <w:ilvl w:val="0"/>
-          <w:numId w:val="10"/>
-        </w:numPr>
-      </w:pPr>
-      <w:r>
-        <w:t>Teams</w:t>
-      </w:r>
-    </w:p>
-    <w:p>
-      <w:pPr>
-        <w:pStyle w:val="Compact"/>
-        <w:numPr>
-          <w:ilvl w:val="0"/>
-          <w:numId w:val="10"/>
-        </w:numPr>
-      </w:pPr>
-      <w:r>
-        <w:t>OneDrive</w:t>
-      </w:r>
-    </w:p>
-    <w:p>
-      <w:pPr>
-        <w:pStyle w:val="Compact"/>
-        <w:numPr>
-          <w:ilvl w:val="0"/>
-          <w:numId w:val="10"/>
-        </w:numPr>
-      </w:pPr>
-      <w:r>
-        <w:t>Overleaf</w:t>
-      </w:r>
-    </w:p>
-    <w:p>
-      <w:pPr>
-        <w:pStyle w:val="FirstParagraph"/>
-      </w:pPr>
-      <w:r>
-        <w:t>Deliverable:</w:t>
-      </w:r>
-    </w:p>
-    <w:p>
-      <w:pPr>
-        <w:pStyle w:val="BodyText"/>
-      </w:pPr>
-      <w:r>
-        <w:t>Personal productivity environment</w:t>
-      </w:r>
-    </w:p>
-    <w:p>
-      <w:r>
-        <w:pict w14:anchorId="51F50AF8">
-          <v:rect id="_x0000_i1032" style="width:0;height:1.5pt" o:hralign="center" o:hrstd="t" o:hr="t"/>
-        </w:pict>
-      </w:r>
-    </w:p>
-    <w:p>
-      <w:pPr>
-        <w:pStyle w:val="Heading2"/>
-      </w:pPr>
-      <w:bookmarkStart w:id="27" w:name="week-3"/>
-      <w:bookmarkEnd w:id="26"/>
       <w:r>
         <w:lastRenderedPageBreak/>
         <w:t>Week 3</w:t>
@@ -1317,8 +1328,11 @@
     </w:p>
     <w:p>
       <w:r>
-        <w:pict w14:anchorId="40B2A290">
-          <v:rect id="_x0000_i1033" style="width:0;height:1.5pt" o:hralign="center" o:hrstd="t" o:hr="t"/>
+        <w:rPr>
+          <w:noProof/>
+        </w:rPr>
+        <w:pict w14:anchorId="06199848">
+          <v:rect id="_x0000_i1039" alt="" style="width:468pt;height:.05pt;mso-width-percent:0;mso-height-percent:0;mso-width-percent:0;mso-height-percent:0" o:hralign="center" o:hrstd="t" o:hr="t"/>
         </w:pict>
       </w:r>
     </w:p>
@@ -1326,8 +1340,8 @@
       <w:pPr>
         <w:pStyle w:val="Heading2"/>
       </w:pPr>
-      <w:bookmarkStart w:id="28" w:name="week-4"/>
-      <w:bookmarkEnd w:id="27"/>
+      <w:bookmarkStart w:id="16" w:name="week-4"/>
+      <w:bookmarkEnd w:id="15"/>
       <w:r>
         <w:t>Week 4</w:t>
       </w:r>
@@ -1414,8 +1428,11 @@
     </w:p>
     <w:p>
       <w:r>
-        <w:pict w14:anchorId="20133951">
-          <v:rect id="_x0000_i1034" style="width:0;height:1.5pt" o:hralign="center" o:hrstd="t" o:hr="t"/>
+        <w:rPr>
+          <w:noProof/>
+        </w:rPr>
+        <w:pict w14:anchorId="3EB7882A">
+          <v:rect id="_x0000_i1038" alt="" style="width:468pt;height:.05pt;mso-width-percent:0;mso-height-percent:0;mso-width-percent:0;mso-height-percent:0" o:hralign="center" o:hrstd="t" o:hr="t"/>
         </w:pict>
       </w:r>
     </w:p>
@@ -1423,8 +1440,8 @@
       <w:pPr>
         <w:pStyle w:val="Heading2"/>
       </w:pPr>
-      <w:bookmarkStart w:id="29" w:name="week-5"/>
-      <w:bookmarkEnd w:id="28"/>
+      <w:bookmarkStart w:id="17" w:name="week-5"/>
+      <w:bookmarkEnd w:id="16"/>
       <w:r>
         <w:t>Week 5</w:t>
       </w:r>
@@ -1499,8 +1516,11 @@
     </w:p>
     <w:p>
       <w:r>
-        <w:pict w14:anchorId="1C8AAB73">
-          <v:rect id="_x0000_i1035" style="width:0;height:1.5pt" o:hralign="center" o:hrstd="t" o:hr="t"/>
+        <w:rPr>
+          <w:noProof/>
+        </w:rPr>
+        <w:pict w14:anchorId="09267BF9">
+          <v:rect id="_x0000_i1037" alt="" style="width:468pt;height:.05pt;mso-width-percent:0;mso-height-percent:0;mso-width-percent:0;mso-height-percent:0" o:hralign="center" o:hrstd="t" o:hr="t"/>
         </w:pict>
       </w:r>
     </w:p>
@@ -1508,8 +1528,8 @@
       <w:pPr>
         <w:pStyle w:val="Heading2"/>
       </w:pPr>
-      <w:bookmarkStart w:id="30" w:name="week-6"/>
-      <w:bookmarkEnd w:id="29"/>
+      <w:bookmarkStart w:id="18" w:name="week-6"/>
+      <w:bookmarkEnd w:id="17"/>
       <w:r>
         <w:lastRenderedPageBreak/>
         <w:t>Week 6</w:t>
@@ -1597,8 +1617,11 @@
     </w:p>
     <w:p>
       <w:r>
-        <w:pict w14:anchorId="0EE01826">
-          <v:rect id="_x0000_i1036" style="width:0;height:1.5pt" o:hralign="center" o:hrstd="t" o:hr="t"/>
+        <w:rPr>
+          <w:noProof/>
+        </w:rPr>
+        <w:pict w14:anchorId="784C0DAB">
+          <v:rect id="_x0000_i1036" alt="" style="width:468pt;height:.05pt;mso-width-percent:0;mso-height-percent:0;mso-width-percent:0;mso-height-percent:0" o:hralign="center" o:hrstd="t" o:hr="t"/>
         </w:pict>
       </w:r>
     </w:p>
@@ -1606,8 +1629,8 @@
       <w:pPr>
         <w:pStyle w:val="Heading2"/>
       </w:pPr>
-      <w:bookmarkStart w:id="31" w:name="week-7"/>
-      <w:bookmarkEnd w:id="30"/>
+      <w:bookmarkStart w:id="19" w:name="week-7"/>
+      <w:bookmarkEnd w:id="18"/>
       <w:r>
         <w:t>Week 7</w:t>
       </w:r>
@@ -1694,8 +1717,11 @@
     </w:p>
     <w:p>
       <w:r>
-        <w:pict w14:anchorId="460B1437">
-          <v:rect id="_x0000_i1037" style="width:0;height:1.5pt" o:hralign="center" o:hrstd="t" o:hr="t"/>
+        <w:rPr>
+          <w:noProof/>
+        </w:rPr>
+        <w:pict w14:anchorId="78599B48">
+          <v:rect id="_x0000_i1035" alt="" style="width:468pt;height:.05pt;mso-width-percent:0;mso-height-percent:0;mso-width-percent:0;mso-height-percent:0" o:hralign="center" o:hrstd="t" o:hr="t"/>
         </w:pict>
       </w:r>
     </w:p>
@@ -1703,8 +1729,8 @@
       <w:pPr>
         <w:pStyle w:val="Heading2"/>
       </w:pPr>
-      <w:bookmarkStart w:id="32" w:name="week-8"/>
-      <w:bookmarkEnd w:id="31"/>
+      <w:bookmarkStart w:id="20" w:name="week-8"/>
+      <w:bookmarkEnd w:id="19"/>
       <w:r>
         <w:t>Week 8</w:t>
       </w:r>
@@ -1779,8 +1805,11 @@
     </w:p>
     <w:p>
       <w:r>
-        <w:pict w14:anchorId="3213547A">
-          <v:rect id="_x0000_i1038" style="width:0;height:1.5pt" o:hralign="center" o:hrstd="t" o:hr="t"/>
+        <w:rPr>
+          <w:noProof/>
+        </w:rPr>
+        <w:pict w14:anchorId="350ECD50">
+          <v:rect id="_x0000_i1034" alt="" style="width:468pt;height:.05pt;mso-width-percent:0;mso-height-percent:0;mso-width-percent:0;mso-height-percent:0" o:hralign="center" o:hrstd="t" o:hr="t"/>
         </w:pict>
       </w:r>
     </w:p>
@@ -1788,8 +1817,8 @@
       <w:pPr>
         <w:pStyle w:val="Heading2"/>
       </w:pPr>
-      <w:bookmarkStart w:id="33" w:name="week-9"/>
-      <w:bookmarkEnd w:id="32"/>
+      <w:bookmarkStart w:id="21" w:name="week-9"/>
+      <w:bookmarkEnd w:id="20"/>
       <w:r>
         <w:lastRenderedPageBreak/>
         <w:t>Week 9</w:t>
@@ -1865,8 +1894,11 @@
     </w:p>
     <w:p>
       <w:r>
-        <w:pict w14:anchorId="2A9CA5A3">
-          <v:rect id="_x0000_i1039" style="width:0;height:1.5pt" o:hralign="center" o:hrstd="t" o:hr="t"/>
+        <w:rPr>
+          <w:noProof/>
+        </w:rPr>
+        <w:pict w14:anchorId="2914C077">
+          <v:rect id="_x0000_i1033" alt="" style="width:468pt;height:.05pt;mso-width-percent:0;mso-height-percent:0;mso-width-percent:0;mso-height-percent:0" o:hralign="center" o:hrstd="t" o:hr="t"/>
         </w:pict>
       </w:r>
     </w:p>
@@ -1874,8 +1906,8 @@
       <w:pPr>
         <w:pStyle w:val="Heading2"/>
       </w:pPr>
-      <w:bookmarkStart w:id="34" w:name="week-10"/>
-      <w:bookmarkEnd w:id="33"/>
+      <w:bookmarkStart w:id="22" w:name="week-10"/>
+      <w:bookmarkEnd w:id="21"/>
       <w:r>
         <w:t>Week 10</w:t>
       </w:r>
@@ -1950,8 +1982,11 @@
     </w:p>
     <w:p>
       <w:r>
-        <w:pict w14:anchorId="568B2578">
-          <v:rect id="_x0000_i1040" style="width:0;height:1.5pt" o:hralign="center" o:hrstd="t" o:hr="t"/>
+        <w:rPr>
+          <w:noProof/>
+        </w:rPr>
+        <w:pict w14:anchorId="7F24AD7C">
+          <v:rect id="_x0000_i1032" alt="" style="width:468pt;height:.05pt;mso-width-percent:0;mso-height-percent:0;mso-width-percent:0;mso-height-percent:0" o:hralign="center" o:hrstd="t" o:hr="t"/>
         </w:pict>
       </w:r>
     </w:p>
@@ -1959,8 +1994,8 @@
       <w:pPr>
         <w:pStyle w:val="Heading2"/>
       </w:pPr>
-      <w:bookmarkStart w:id="35" w:name="week-11"/>
-      <w:bookmarkEnd w:id="34"/>
+      <w:bookmarkStart w:id="23" w:name="week-11"/>
+      <w:bookmarkEnd w:id="22"/>
       <w:r>
         <w:t>Week 11</w:t>
       </w:r>
@@ -2047,8 +2082,11 @@
     </w:p>
     <w:p>
       <w:r>
-        <w:pict w14:anchorId="332962D5">
-          <v:rect id="_x0000_i1041" style="width:0;height:1.5pt" o:hralign="center" o:hrstd="t" o:hr="t"/>
+        <w:rPr>
+          <w:noProof/>
+        </w:rPr>
+        <w:pict w14:anchorId="4241D0E6">
+          <v:rect id="_x0000_i1031" alt="" style="width:468pt;height:.05pt;mso-width-percent:0;mso-height-percent:0;mso-width-percent:0;mso-height-percent:0" o:hralign="center" o:hrstd="t" o:hr="t"/>
         </w:pict>
       </w:r>
     </w:p>
@@ -2056,8 +2094,8 @@
       <w:pPr>
         <w:pStyle w:val="Heading2"/>
       </w:pPr>
-      <w:bookmarkStart w:id="36" w:name="week-12"/>
-      <w:bookmarkEnd w:id="35"/>
+      <w:bookmarkStart w:id="24" w:name="week-12"/>
+      <w:bookmarkEnd w:id="23"/>
       <w:r>
         <w:lastRenderedPageBreak/>
         <w:t>Week 12</w:t>
@@ -2145,8 +2183,11 @@
     </w:p>
     <w:p>
       <w:r>
-        <w:pict w14:anchorId="55C150FB">
-          <v:rect id="_x0000_i1042" style="width:0;height:1.5pt" o:hralign="center" o:hrstd="t" o:hr="t"/>
+        <w:rPr>
+          <w:noProof/>
+        </w:rPr>
+        <w:pict w14:anchorId="794640B0">
+          <v:rect id="_x0000_i1030" alt="" style="width:468pt;height:.05pt;mso-width-percent:0;mso-height-percent:0;mso-width-percent:0;mso-height-percent:0" o:hralign="center" o:hrstd="t" o:hr="t"/>
         </w:pict>
       </w:r>
     </w:p>
@@ -2154,8 +2195,8 @@
       <w:pPr>
         <w:pStyle w:val="Heading2"/>
       </w:pPr>
-      <w:bookmarkStart w:id="37" w:name="week-13"/>
-      <w:bookmarkEnd w:id="36"/>
+      <w:bookmarkStart w:id="25" w:name="week-13"/>
+      <w:bookmarkEnd w:id="24"/>
       <w:r>
         <w:t>Week 13</w:t>
       </w:r>
@@ -2242,8 +2283,11 @@
     </w:p>
     <w:p>
       <w:r>
-        <w:pict w14:anchorId="744C9196">
-          <v:rect id="_x0000_i1043" style="width:0;height:1.5pt" o:hralign="center" o:hrstd="t" o:hr="t"/>
+        <w:rPr>
+          <w:noProof/>
+        </w:rPr>
+        <w:pict w14:anchorId="501683A8">
+          <v:rect id="_x0000_i1029" alt="" style="width:468pt;height:.05pt;mso-width-percent:0;mso-height-percent:0;mso-width-percent:0;mso-height-percent:0" o:hralign="center" o:hrstd="t" o:hr="t"/>
         </w:pict>
       </w:r>
     </w:p>
@@ -2251,8 +2295,8 @@
       <w:pPr>
         <w:pStyle w:val="Heading2"/>
       </w:pPr>
-      <w:bookmarkStart w:id="38" w:name="week-14"/>
-      <w:bookmarkEnd w:id="37"/>
+      <w:bookmarkStart w:id="26" w:name="week-14"/>
+      <w:bookmarkEnd w:id="25"/>
       <w:r>
         <w:t>Week 14</w:t>
       </w:r>
@@ -2327,8 +2371,11 @@
     </w:p>
     <w:p>
       <w:r>
-        <w:pict w14:anchorId="387A109E">
-          <v:rect id="_x0000_i1044" style="width:0;height:1.5pt" o:hralign="center" o:hrstd="t" o:hr="t"/>
+        <w:rPr>
+          <w:noProof/>
+        </w:rPr>
+        <w:pict w14:anchorId="3D971882">
+          <v:rect id="_x0000_i1028" alt="" style="width:468pt;height:.05pt;mso-width-percent:0;mso-height-percent:0;mso-width-percent:0;mso-height-percent:0" o:hralign="center" o:hrstd="t" o:hr="t"/>
         </w:pict>
       </w:r>
     </w:p>
@@ -2336,8 +2383,8 @@
       <w:pPr>
         <w:pStyle w:val="Heading2"/>
       </w:pPr>
-      <w:bookmarkStart w:id="39" w:name="week-15"/>
-      <w:bookmarkEnd w:id="38"/>
+      <w:bookmarkStart w:id="27" w:name="week-15"/>
+      <w:bookmarkEnd w:id="26"/>
       <w:r>
         <w:lastRenderedPageBreak/>
         <w:t>Week 15</w:t>
@@ -2369,8 +2416,11 @@
     </w:p>
     <w:p>
       <w:r>
-        <w:pict w14:anchorId="3DDC513E">
-          <v:rect id="_x0000_i1045" style="width:0;height:1.5pt" o:hralign="center" o:hrstd="t" o:hr="t"/>
+        <w:rPr>
+          <w:noProof/>
+        </w:rPr>
+        <w:pict w14:anchorId="5E8908AF">
+          <v:rect id="_x0000_i1027" alt="" style="width:468pt;height:.05pt;mso-width-percent:0;mso-height-percent:0;mso-width-percent:0;mso-height-percent:0" o:hralign="center" o:hrstd="t" o:hr="t"/>
         </w:pict>
       </w:r>
     </w:p>
@@ -2378,9 +2428,9 @@
       <w:pPr>
         <w:pStyle w:val="Heading1"/>
       </w:pPr>
-      <w:bookmarkStart w:id="40" w:name="expected-weekly-workload"/>
-      <w:bookmarkEnd w:id="24"/>
-      <w:bookmarkEnd w:id="39"/>
+      <w:bookmarkStart w:id="28" w:name="expected-weekly-workload"/>
+      <w:bookmarkEnd w:id="12"/>
+      <w:bookmarkEnd w:id="27"/>
       <w:r>
         <w:t>Expected Weekly Workload</w:t>
       </w:r>
@@ -2435,8 +2485,11 @@
     </w:p>
     <w:p>
       <w:r>
-        <w:pict w14:anchorId="48259B2E">
-          <v:rect id="_x0000_i1046" style="width:0;height:1.5pt" o:hralign="center" o:hrstd="t" o:hr="t"/>
+        <w:rPr>
+          <w:noProof/>
+        </w:rPr>
+        <w:pict w14:anchorId="5AE47049">
+          <v:rect id="_x0000_i1026" alt="" style="width:468pt;height:.05pt;mso-width-percent:0;mso-height-percent:0;mso-width-percent:0;mso-height-percent:0" o:hralign="center" o:hrstd="t" o:hr="t"/>
         </w:pict>
       </w:r>
     </w:p>
@@ -2444,8 +2497,8 @@
       <w:pPr>
         <w:pStyle w:val="Heading1"/>
       </w:pPr>
-      <w:bookmarkStart w:id="41" w:name="academic-integrity-and-ai-usage"/>
-      <w:bookmarkEnd w:id="40"/>
+      <w:bookmarkStart w:id="29" w:name="academic-integrity-and-ai-usage"/>
+      <w:bookmarkEnd w:id="28"/>
       <w:r>
         <w:t>Academic Integrity and AI Usage</w:t>
       </w:r>
@@ -2544,8 +2597,11 @@
     </w:p>
     <w:p>
       <w:r>
-        <w:pict w14:anchorId="65BEFD83">
-          <v:rect id="_x0000_i1047" style="width:0;height:1.5pt" o:hralign="center" o:hrstd="t" o:hr="t"/>
+        <w:rPr>
+          <w:noProof/>
+        </w:rPr>
+        <w:pict w14:anchorId="48CEECEC">
+          <v:rect id="_x0000_i1025" alt="" style="width:468pt;height:.05pt;mso-width-percent:0;mso-height-percent:0;mso-width-percent:0;mso-height-percent:0" o:hralign="center" o:hrstd="t" o:hr="t"/>
         </w:pict>
       </w:r>
     </w:p>
@@ -2553,8 +2609,8 @@
       <w:pPr>
         <w:pStyle w:val="Heading1"/>
       </w:pPr>
-      <w:bookmarkStart w:id="42" w:name="university-policies"/>
-      <w:bookmarkEnd w:id="41"/>
+      <w:bookmarkStart w:id="30" w:name="university-policies"/>
+      <w:bookmarkEnd w:id="29"/>
       <w:r>
         <w:t>University Policies</w:t>
       </w:r>
@@ -2659,7 +2715,309 @@
       <w:r>
         <w:t>shall apply and will be incorporated into the official syllabus in accordance with current University requirements.</w:t>
       </w:r>
-      <w:bookmarkEnd w:id="42"/>
+      <w:bookmarkEnd w:id="30"/>
+    </w:p>
+    <w:p>
+      <w:pPr>
+        <w:pStyle w:val="BodyText"/>
+      </w:pPr>
+    </w:p>
+    <w:p>
+      <w:pPr>
+        <w:pStyle w:val="Heading1"/>
+      </w:pPr>
+      <w:r>
+        <w:t>Additional information</w:t>
+      </w:r>
+    </w:p>
+    <w:p>
+      <w:pPr>
+        <w:pStyle w:val="BodyText"/>
+        <w:rPr>
+          <w:rFonts w:cstheme="majorBidi"/>
+        </w:rPr>
+      </w:pPr>
+      <w:r>
+        <w:rPr>
+          <w:b/>
+          <w:bCs/>
+        </w:rPr>
+        <w:t>The syllabus may be changed</w:t>
+      </w:r>
+      <w:r>
+        <w:rPr>
+          <w:b/>
+          <w:bCs/>
+        </w:rPr>
+        <w:t>.</w:t>
+      </w:r>
+      <w:r>
+        <w:t xml:space="preserve"> The syllabus is meant to serve as an</w:t>
+      </w:r>
+      <w:r>
+        <w:t xml:space="preserve"> </w:t>
+      </w:r>
+      <w:r>
+        <w:t>outline and guide for our course. Please note that I may modify it with</w:t>
+      </w:r>
+      <w:r>
+        <w:t xml:space="preserve"> </w:t>
+      </w:r>
+      <w:r>
+        <w:t>reasonable notice to you. I may also modify the course schedule and dates</w:t>
+      </w:r>
+      <w:r>
+        <w:t xml:space="preserve"> </w:t>
+      </w:r>
+      <w:r>
+        <w:t>of the midterms depending on the needs of our class. Any changes will be</w:t>
+      </w:r>
+      <w:r>
+        <w:t xml:space="preserve"> </w:t>
+      </w:r>
+      <w:r>
+        <w:t>announced in class and posted on Canvas.</w:t>
+      </w:r>
+    </w:p>
+    <w:p>
+      <w:pPr>
+        <w:autoSpaceDE w:val="0"/>
+        <w:autoSpaceDN w:val="0"/>
+        <w:adjustRightInd w:val="0"/>
+        <w:spacing w:after="0"/>
+        <w:rPr>
+          <w:rFonts w:cs="Times New Roman"/>
+        </w:rPr>
+      </w:pPr>
+    </w:p>
+    <w:p>
+      <w:pPr>
+        <w:autoSpaceDE w:val="0"/>
+        <w:autoSpaceDN w:val="0"/>
+        <w:adjustRightInd w:val="0"/>
+        <w:spacing w:after="0"/>
+        <w:rPr>
+          <w:rFonts w:cs="Times New Roman"/>
+        </w:rPr>
+      </w:pPr>
+      <w:r>
+        <w:rPr>
+          <w:rFonts w:cs="Times New Roman"/>
+          <w:b/>
+          <w:bCs/>
+        </w:rPr>
+        <w:t>The Office of the Dean of Students</w:t>
+      </w:r>
+      <w:r>
+        <w:rPr>
+          <w:rFonts w:cs="Times New Roman"/>
+        </w:rPr>
+        <w:t xml:space="preserve"> is dedicated to being a resource</w:t>
+      </w:r>
+    </w:p>
+    <w:p>
+      <w:pPr>
+        <w:autoSpaceDE w:val="0"/>
+        <w:autoSpaceDN w:val="0"/>
+        <w:adjustRightInd w:val="0"/>
+        <w:spacing w:after="0"/>
+        <w:rPr>
+          <w:rFonts w:cs="Times New Roman"/>
+        </w:rPr>
+      </w:pPr>
+      <w:r>
+        <w:rPr>
+          <w:rFonts w:cs="Times New Roman"/>
+        </w:rPr>
+        <w:t>to students through support, advocacy, involvement, and accountability.</w:t>
+      </w:r>
+    </w:p>
+    <w:p>
+      <w:pPr>
+        <w:autoSpaceDE w:val="0"/>
+        <w:autoSpaceDN w:val="0"/>
+        <w:adjustRightInd w:val="0"/>
+        <w:spacing w:after="0"/>
+        <w:rPr>
+          <w:rFonts w:cs="Times New Roman"/>
+        </w:rPr>
+      </w:pPr>
+      <w:r>
+        <w:rPr>
+          <w:rFonts w:cs="Times New Roman"/>
+        </w:rPr>
+        <w:t>Please consider reaching out to the Office of Dean of Students for any questions,</w:t>
+      </w:r>
+    </w:p>
+    <w:p>
+      <w:pPr>
+        <w:autoSpaceDE w:val="0"/>
+        <w:autoSpaceDN w:val="0"/>
+        <w:adjustRightInd w:val="0"/>
+        <w:spacing w:after="0"/>
+        <w:rPr>
+          <w:rFonts w:cs="Times New Roman"/>
+        </w:rPr>
+      </w:pPr>
+      <w:r>
+        <w:rPr>
+          <w:rFonts w:cs="Times New Roman"/>
+        </w:rPr>
+        <w:t xml:space="preserve">issues and concerns. </w:t>
+      </w:r>
+      <w:hyperlink r:id="rId5" w:history="1">
+        <w:r>
+          <w:rPr>
+            <w:rStyle w:val="Hyperlink"/>
+            <w:rFonts w:cs="Times New Roman"/>
+          </w:rPr>
+          <w:t>https://deanofstudents.utah.edu</w:t>
+        </w:r>
+      </w:hyperlink>
+      <w:r>
+        <w:rPr>
+          <w:rFonts w:cs="Times New Roman"/>
+        </w:rPr>
+        <w:t>.</w:t>
+      </w:r>
+    </w:p>
+    <w:p>
+      <w:pPr>
+        <w:autoSpaceDE w:val="0"/>
+        <w:autoSpaceDN w:val="0"/>
+        <w:adjustRightInd w:val="0"/>
+        <w:spacing w:after="0"/>
+        <w:rPr>
+          <w:rFonts w:cs="Times New Roman"/>
+        </w:rPr>
+      </w:pPr>
+    </w:p>
+    <w:p>
+      <w:pPr>
+        <w:autoSpaceDE w:val="0"/>
+        <w:autoSpaceDN w:val="0"/>
+        <w:adjustRightInd w:val="0"/>
+        <w:spacing w:after="0"/>
+        <w:rPr>
+          <w:rFonts w:cs="Times New Roman"/>
+        </w:rPr>
+      </w:pPr>
+      <w:r>
+        <w:rPr>
+          <w:rFonts w:cs="Times New Roman"/>
+          <w:b/>
+          <w:bCs/>
+        </w:rPr>
+        <w:t>The American with Disabilities Act</w:t>
+      </w:r>
+      <w:r>
+        <w:rPr>
+          <w:rFonts w:cs="Times New Roman"/>
+        </w:rPr>
+        <w:t xml:space="preserve"> requires that reasonable accommodations</w:t>
+      </w:r>
+    </w:p>
+    <w:p>
+      <w:pPr>
+        <w:autoSpaceDE w:val="0"/>
+        <w:autoSpaceDN w:val="0"/>
+        <w:adjustRightInd w:val="0"/>
+        <w:spacing w:after="0"/>
+        <w:rPr>
+          <w:rFonts w:cs="Times New Roman"/>
+        </w:rPr>
+      </w:pPr>
+      <w:r>
+        <w:rPr>
+          <w:rFonts w:cs="Times New Roman"/>
+        </w:rPr>
+        <w:t>be provided for students with physical, systemic, learning, and</w:t>
+      </w:r>
+    </w:p>
+    <w:p>
+      <w:pPr>
+        <w:autoSpaceDE w:val="0"/>
+        <w:autoSpaceDN w:val="0"/>
+        <w:adjustRightInd w:val="0"/>
+        <w:spacing w:after="0"/>
+        <w:rPr>
+          <w:rFonts w:cs="Times New Roman"/>
+        </w:rPr>
+      </w:pPr>
+      <w:r>
+        <w:rPr>
+          <w:rFonts w:cs="Times New Roman"/>
+        </w:rPr>
+        <w:t>other disabilities. The University of Utah seeks to provide equal access to its</w:t>
+      </w:r>
+    </w:p>
+    <w:p>
+      <w:pPr>
+        <w:autoSpaceDE w:val="0"/>
+        <w:autoSpaceDN w:val="0"/>
+        <w:adjustRightInd w:val="0"/>
+        <w:spacing w:after="0"/>
+        <w:rPr>
+          <w:rFonts w:cs="Times New Roman"/>
+        </w:rPr>
+      </w:pPr>
+      <w:r>
+        <w:rPr>
+          <w:rFonts w:cs="Times New Roman"/>
+        </w:rPr>
+        <w:t>programs, services and activities for people with disabilities. Please contact</w:t>
+      </w:r>
+    </w:p>
+    <w:p>
+      <w:pPr>
+        <w:autoSpaceDE w:val="0"/>
+        <w:autoSpaceDN w:val="0"/>
+        <w:adjustRightInd w:val="0"/>
+        <w:spacing w:after="0"/>
+        <w:rPr>
+          <w:rFonts w:cs="Times New Roman"/>
+        </w:rPr>
+      </w:pPr>
+      <w:r>
+        <w:rPr>
+          <w:rFonts w:cs="Times New Roman"/>
+        </w:rPr>
+        <w:t>me at the beginning of the semester to discuss any such accommodations</w:t>
+      </w:r>
+    </w:p>
+    <w:p>
+      <w:pPr>
+        <w:autoSpaceDE w:val="0"/>
+        <w:autoSpaceDN w:val="0"/>
+        <w:adjustRightInd w:val="0"/>
+        <w:spacing w:after="0"/>
+        <w:rPr>
+          <w:rFonts w:cs="Times New Roman"/>
+        </w:rPr>
+      </w:pPr>
+      <w:r>
+        <w:rPr>
+          <w:rFonts w:cs="Times New Roman"/>
+        </w:rPr>
+        <w:t>for the course.</w:t>
+      </w:r>
+    </w:p>
+    <w:p>
+      <w:pPr>
+        <w:autoSpaceDE w:val="0"/>
+        <w:autoSpaceDN w:val="0"/>
+        <w:adjustRightInd w:val="0"/>
+        <w:spacing w:after="0"/>
+        <w:rPr>
+          <w:rFonts w:cs="Times New Roman"/>
+        </w:rPr>
+      </w:pPr>
+      <w:r>
+        <w:rPr>
+          <w:rFonts w:cs="Times New Roman"/>
+        </w:rPr>
+        <w:t>4</w:t>
+      </w:r>
     </w:p>
     <w:sectPr>
       <w:footnotePr>
@@ -2674,7 +3032,7 @@
 </file>
 
 <file path=word/numbering.xml><?xml version="1.0" encoding="utf-8"?>
-<w:numbering xmlns:wpc="http://schemas.microsoft.com/office/word/2010/wordprocessingCanvas" xmlns:cx="http://schemas.microsoft.com/office/drawing/2014/chartex" xmlns:cx1="http://schemas.microsoft.com/office/drawing/2015/9/8/chartex" xmlns:cx2="http://schemas.microsoft.com/office/drawing/2015/10/21/chartex" xmlns:cx3="http://schemas.microsoft.com/office/drawing/2016/5/9/chartex" xmlns:cx4="http://schemas.microsoft.com/office/drawing/2016/5/10/chartex" xmlns:cx5="http://schemas.microsoft.com/office/drawing/2016/5/11/chartex" xmlns:cx6="http://schemas.microsoft.com/office/drawing/2016/5/12/chartex" xmlns:cx7="http://schemas.microsoft.com/office/drawing/2016/5/13/chartex" xmlns:cx8="http://schemas.microsoft.com/office/drawing/2016/5/14/chartex" xmlns:mc="http://schemas.openxmlformats.org/markup-compatibility/2006" xmlns:aink="http://schemas.microsoft.com/office/drawing/2016/ink" xmlns:am3d="http://schemas.microsoft.com/office/drawing/2017/model3d" xmlns:o="urn:schemas-microsoft-com:office:office" xmlns:oel="http://schemas.microsoft.com/office/2019/extlst" xmlns:r="http://schemas.openxmlformats.org/officeDocument/2006/relationships" xmlns:m="http://schemas.openxmlformats.org/officeDocument/2006/math" xmlns:v="urn:schemas-microsoft-com:vml" xmlns:wp14="http://schemas.microsoft.com/office/word/2010/wordprocessingDrawing" xmlns:wp="http://schemas.openxmlformats.org/drawingml/2006/wordprocessingDrawing" xmlns:w10="urn:schemas-microsoft-com:office:word" xmlns:w="http://schemas.openxmlformats.org/wordprocessingml/2006/main" xmlns:w14="http://schemas.microsoft.com/office/word/2010/wordml" xmlns:w15="http://schemas.microsoft.com/office/word/2012/wordml" xmlns:w16cex="http://schemas.microsoft.com/office/word/2018/wordml/cex" xmlns:w16cid="http://schemas.microsoft.com/office/word/2016/wordml/cid" xmlns:w16="http://schemas.microsoft.com/office/word/2018/wordml" xmlns:w16du="http://schemas.microsoft.com/office/word/2023/wordml/word16du" xmlns:w16sdtdh="http://schemas.microsoft.com/office/word/2020/wordml/sdtdatahash" xmlns:w16sdtfl="http://schemas.microsoft.com/office/word/2024/wordml/sdtformatlock" xmlns:w16se="http://schemas.microsoft.com/office/word/2015/wordml/symex" xmlns:wpg="http://schemas.microsoft.com/office/word/2010/wordprocessingGroup" xmlns:wpi="http://schemas.microsoft.com/office/word/2010/wordprocessingInk" xmlns:wne="http://schemas.microsoft.com/office/word/2006/wordml" xmlns:wps="http://schemas.microsoft.com/office/word/2010/wordprocessingShape" mc:Ignorable="w14 w15 w16se w16cid w16 w16cex w16sdtdh w16sdtfl w16du wp14">
+<w:numbering xmlns:wpc="http://schemas.microsoft.com/office/word/2010/wordprocessingCanvas" xmlns:cx="http://schemas.microsoft.com/office/drawing/2014/chartex" xmlns:cx1="http://schemas.microsoft.com/office/drawing/2015/9/8/chartex" xmlns:cx2="http://schemas.microsoft.com/office/drawing/2015/10/21/chartex" xmlns:cx3="http://schemas.microsoft.com/office/drawing/2016/5/9/chartex" xmlns:cx4="http://schemas.microsoft.com/office/drawing/2016/5/10/chartex" xmlns:cx5="http://schemas.microsoft.com/office/drawing/2016/5/11/chartex" xmlns:cx6="http://schemas.microsoft.com/office/drawing/2016/5/12/chartex" xmlns:cx7="http://schemas.microsoft.com/office/drawing/2016/5/13/chartex" xmlns:cx8="http://schemas.microsoft.com/office/drawing/2016/5/14/chartex" xmlns:mc="http://schemas.openxmlformats.org/markup-compatibility/2006" xmlns:m="http://schemas.openxmlformats.org/officeDocument/2006/math" xmlns:aink="http://schemas.microsoft.com/office/drawing/2016/ink" xmlns:am3d="http://schemas.microsoft.com/office/drawing/2017/model3d" xmlns:oel="http://schemas.microsoft.com/office/2019/extlst" xmlns:r="http://schemas.openxmlformats.org/officeDocument/2006/relationships" xmlns:wp14="http://schemas.microsoft.com/office/word/2010/wordprocessingDrawing" xmlns:wp="http://schemas.openxmlformats.org/drawingml/2006/wordprocessingDrawing" xmlns:wpg="http://schemas.microsoft.com/office/word/2010/wordprocessingGroup" xmlns:wpi="http://schemas.microsoft.com/office/word/2010/wordprocessingInk" xmlns:wps="http://schemas.microsoft.com/office/word/2010/wordprocessingShape" xmlns:o="urn:schemas-microsoft-com:office:office" xmlns:v="urn:schemas-microsoft-com:vml" xmlns:w10="urn:schemas-microsoft-com:office:word" xmlns:w="http://schemas.openxmlformats.org/wordprocessingml/2006/main" xmlns:w14="http://schemas.microsoft.com/office/word/2010/wordml" xmlns:w15="http://schemas.microsoft.com/office/word/2012/wordml" xmlns:w16cex="http://schemas.microsoft.com/office/word/2018/wordml/cex" xmlns:w16cid="http://schemas.microsoft.com/office/word/2016/wordml/cid" xmlns:w16="http://schemas.microsoft.com/office/word/2018/wordml" xmlns:w16sdtdh="http://schemas.microsoft.com/office/word/2020/wordml/sdtdatahash" xmlns:w16sdtfl="http://schemas.microsoft.com/office/word/2024/wordml/sdtformatlock" xmlns:w16se="http://schemas.microsoft.com/office/word/2015/wordml/symex" xmlns:w16du="http://schemas.microsoft.com/office/word/2023/wordml/word16du" xmlns:wne="http://schemas.microsoft.com/office/word/2006/wordml" mc:Ignorable="w14 w15 w16se w16cid w16 w16cex w16sdtdh w16sdtfl w16du wp14">
   <w:abstractNum w:abstractNumId="0" w15:restartNumberingAfterBreak="0">
     <w:nsid w:val="0000A990"/>
     <w:multiLevelType w:val="multilevel"/>
@@ -3048,7 +3406,7 @@
 </file>
 
 <file path=word/styles.xml><?xml version="1.0" encoding="utf-8"?>
-<w:styles xmlns:mc="http://schemas.openxmlformats.org/markup-compatibility/2006" xmlns:r="http://schemas.openxmlformats.org/officeDocument/2006/relationships" xmlns:w="http://schemas.openxmlformats.org/wordprocessingml/2006/main" xmlns:w14="http://schemas.microsoft.com/office/word/2010/wordml" xmlns:w15="http://schemas.microsoft.com/office/word/2012/wordml" xmlns:w16cex="http://schemas.microsoft.com/office/word/2018/wordml/cex" xmlns:w16cid="http://schemas.microsoft.com/office/word/2016/wordml/cid" xmlns:w16="http://schemas.microsoft.com/office/word/2018/wordml" xmlns:w16du="http://schemas.microsoft.com/office/word/2023/wordml/word16du" xmlns:w16sdtdh="http://schemas.microsoft.com/office/word/2020/wordml/sdtdatahash" xmlns:w16sdtfl="http://schemas.microsoft.com/office/word/2024/wordml/sdtformatlock" xmlns:w16se="http://schemas.microsoft.com/office/word/2015/wordml/symex" mc:Ignorable="w14 w15 w16se w16cid w16 w16cex w16sdtdh w16sdtfl w16du">
+<w:styles xmlns:mc="http://schemas.openxmlformats.org/markup-compatibility/2006" xmlns:r="http://schemas.openxmlformats.org/officeDocument/2006/relationships" xmlns:w="http://schemas.openxmlformats.org/wordprocessingml/2006/main" xmlns:w14="http://schemas.microsoft.com/office/word/2010/wordml" xmlns:w15="http://schemas.microsoft.com/office/word/2012/wordml" xmlns:w16cex="http://schemas.microsoft.com/office/word/2018/wordml/cex" xmlns:w16cid="http://schemas.microsoft.com/office/word/2016/wordml/cid" xmlns:w16="http://schemas.microsoft.com/office/word/2018/wordml" xmlns:w16sdtdh="http://schemas.microsoft.com/office/word/2020/wordml/sdtdatahash" xmlns:w16sdtfl="http://schemas.microsoft.com/office/word/2024/wordml/sdtformatlock" xmlns:w16se="http://schemas.microsoft.com/office/word/2015/wordml/symex" xmlns:w16du="http://schemas.microsoft.com/office/word/2023/wordml/word16du" mc:Ignorable="w14 w15 w16se w16cid w16 w16cex w16sdtdh w16sdtfl w16du">
   <w:docDefaults>
     <w:rPrDefault>
       <w:rPr>
@@ -3362,7 +3720,6 @@
     <w:next w:val="BodyText"/>
     <w:link w:val="Heading3Char"/>
     <w:uiPriority w:val="9"/>
-    <w:semiHidden/>
     <w:unhideWhenUsed/>
     <w:qFormat/>
     <w:rsid w:val="00A10FD9"/>
@@ -3717,7 +4074,6 @@
     <w:basedOn w:val="DefaultParagraphFont"/>
     <w:link w:val="Heading3"/>
     <w:uiPriority w:val="9"/>
-    <w:semiHidden/>
     <w:rsid w:val="00A10FD9"/>
     <w:rPr>
       <w:rFonts w:eastAsiaTheme="majorEastAsia" w:cstheme="majorBidi"/>
@@ -4255,6 +4611,18 @@
     <w:rPr>
       <w:rFonts w:ascii="Consolas" w:hAnsi="Consolas"/>
       <w:sz w:val="22"/>
+    </w:rPr>
+  </w:style>
+  <w:style w:type="character" w:styleId="UnresolvedMention">
+    <w:name w:val="Unresolved Mention"/>
+    <w:basedOn w:val="DefaultParagraphFont"/>
+    <w:uiPriority w:val="99"/>
+    <w:semiHidden/>
+    <w:unhideWhenUsed/>
+    <w:rsid w:val="0037044A"/>
+    <w:rPr>
+      <w:color w:val="605E5C"/>
+      <w:shd w:val="clear" w:color="auto" w:fill="E1DFDD"/>
     </w:rPr>
   </w:style>
 </w:styles>
@@ -4553,4 +4921,10 @@
     </a:ext>
   </a:extLst>
 </a:theme>
+</file>
+
+<file path=docMetadata/LabelInfo.xml><?xml version="1.0" encoding="utf-8"?>
+<clbl:labelList xmlns:clbl="http://schemas.microsoft.com/office/2020/mipLabelMetadata">
+  <clbl:label id="{170051ed-867f-4092-a6af-8a42e27b7e09}" enabled="1" method="Standard" siteId="{5217e0e7-539d-4563-b1bf-7c6dcf074f91}" contentBits="0" removed="0"/>
+</clbl:labelList>
 </file>
</xml_diff>